<commit_message>
docs: seção de validação backtesting no relatório técnico
Adiciona seção 5 (Validação do Motor de Risco — Backtesting Histórico)
ao relatório técnico com metodologia, tabela de eventos analisados,
tabela de resultados comparativos (3 eventos × 6 colunas), análise
do pior momento registrado (score 0.9260, Kp=9, Maio 2024) e
discussão de limitações do método de validação.

Seções anteriores renumeradas: API REST 5→6, Frontend 6→7,
Limitações 7→8 (incluindo 7.1→8.1), Referências 8→9.
Sumário marcado para regeneração automática ao abrir no Word.

Co-Authored-By: Claude Sonnet 4.6 <noreply@anthropic.com>
</commit_message>
<xml_diff>
--- a/relatorio_tecnico_clima_solar.docx
+++ b/relatorio_tecnico_clima_solar.docx
@@ -5204,6 +5204,11 @@
       </w:r>
     </w:p>
     <w:p>
+      <w:r>
+        <w:br w:type="page"/>
+      </w:r>
+    </w:p>
+    <w:p>
       <w:pPr>
         <w:pStyle w:val="Heading1"/>
         <w:spacing w:after="80" w:before="0"/>
@@ -5220,7 +5225,1524 @@
           <w:sz w:val="24"/>
           <w:szCs w:val="24"/>
         </w:rPr>
-        <w:t xml:space="preserve">5. API REST</w:t>
+        <w:t xml:space="preserve">5. Validacao do Motor de Risco — Backtesting Historico</w:t>
+      </w:r>
+    </w:p>
+    <w:p>
+      <w:pPr>
+        <w:pStyle w:val="Heading2"/>
+        <w:spacing w:after="80" w:before="0"/>
+        <w:jc w:val="left"/>
+      </w:pPr>
+      <w:r>
+        <w:rPr>
+          <w:rFonts w:ascii="Arial" w:cs="Arial" w:eastAsia="Arial" w:hAnsi="Arial"/>
+          <w:b w:val="false"/>
+          <w:bCs w:val="false"/>
+          <w:i w:val="false"/>
+          <w:iCs w:val="false"/>
+          <w:color w:val="000000"/>
+          <w:sz w:val="24"/>
+          <w:szCs w:val="24"/>
+        </w:rPr>
+        <w:t xml:space="preserve">5.1 Metodologia</w:t>
+      </w:r>
+    </w:p>
+    <w:p>
+      <w:pPr>
+        <w:spacing w:after="120" w:before="0"/>
+        <w:jc w:val="left"/>
+      </w:pPr>
+      <w:r>
+        <w:rPr>
+          <w:rFonts w:ascii="Arial" w:cs="Arial" w:eastAsia="Arial" w:hAnsi="Arial"/>
+          <w:b w:val="false"/>
+          <w:bCs w:val="false"/>
+          <w:i w:val="false"/>
+          <w:iCs w:val="false"/>
+          <w:color w:val="000000"/>
+          <w:sz w:val="24"/>
+          <w:szCs w:val="24"/>
+        </w:rPr>
+        <w:t xml:space="preserve">Para validar a calibracao do motor de risco, foi desenvolvido um script de backtesting (backtest_score.py) que coleta dados historicos reais das mesmas fontes utilizadas pelo sistema em producao — Kp via GFZ Potsdam (cobertura desde 1932), Dst via Kyoto World Data Center e F10.7 via NOAA — e executa o motor de risco hora a hora para periodos de interesse. Os dados de cintilacao ionosferica (S4 e sigma_phi) do EMBRACE nao estao disponiveis no historico publico, portanto a validacao considera apenas os tres indices de clima espacial global.</w:t>
+      </w:r>
+    </w:p>
+    <w:p>
+      <w:pPr>
+        <w:pStyle w:val="Heading2"/>
+        <w:spacing w:after="80" w:before="0"/>
+        <w:jc w:val="left"/>
+      </w:pPr>
+      <w:r>
+        <w:rPr>
+          <w:rFonts w:ascii="Arial" w:cs="Arial" w:eastAsia="Arial" w:hAnsi="Arial"/>
+          <w:b w:val="false"/>
+          <w:bCs w:val="false"/>
+          <w:i w:val="false"/>
+          <w:iCs w:val="false"/>
+          <w:color w:val="000000"/>
+          <w:sz w:val="24"/>
+          <w:szCs w:val="24"/>
+        </w:rPr>
+        <w:t xml:space="preserve">5.2 Eventos Analisados</w:t>
+      </w:r>
+    </w:p>
+    <w:tbl>
+      <w:tblPr>
+        <w:tblW w:type="dxa" w:w="9026"/>
+        <w:tblBorders>
+          <w:top w:val="single" w:color="auto" w:sz="4"/>
+          <w:left w:val="single" w:color="auto" w:sz="4"/>
+          <w:bottom w:val="single" w:color="auto" w:sz="4"/>
+          <w:right w:val="single" w:color="auto" w:sz="4"/>
+          <w:insideH w:val="single" w:color="auto" w:sz="4"/>
+          <w:insideV w:val="single" w:color="auto" w:sz="4"/>
+        </w:tblBorders>
+      </w:tblPr>
+      <w:tblGrid>
+        <w:gridCol w:w="3600"/>
+        <w:gridCol w:w="2000"/>
+        <w:gridCol w:w="3426"/>
+      </w:tblGrid>
+      <w:tr>
+        <w:trPr>
+          <w:tblHeader/>
+        </w:trPr>
+        <w:tc>
+          <w:tcPr>
+            <w:tcW w:type="dxa" w:w="3600"/>
+            <w:tcBorders>
+              <w:top w:val="single" w:color="CCCCCC" w:sz="1"/>
+              <w:left w:val="single" w:color="CCCCCC" w:sz="1"/>
+              <w:bottom w:val="single" w:color="CCCCCC" w:sz="1"/>
+              <w:right w:val="single" w:color="CCCCCC" w:sz="1"/>
+            </w:tcBorders>
+            <w:shd w:fill="D9E2F3" w:val="clear"/>
+            <w:tcMar>
+              <w:top w:type="dxa" w:w="80"/>
+              <w:left w:type="dxa" w:w="120"/>
+              <w:bottom w:type="dxa" w:w="80"/>
+              <w:right w:type="dxa" w:w="120"/>
+            </w:tcMar>
+            <w:vAlign w:val="center"/>
+          </w:tcPr>
+          <w:p>
+            <w:pPr>
+              <w:jc w:val="left"/>
+            </w:pPr>
+            <w:r>
+              <w:rPr>
+                <w:rFonts w:ascii="Arial" w:cs="Arial" w:eastAsia="Arial" w:hAnsi="Arial"/>
+                <w:b/>
+                <w:bCs/>
+                <w:i w:val="false"/>
+                <w:iCs w:val="false"/>
+                <w:color w:val="000000"/>
+                <w:sz w:val="22"/>
+                <w:szCs w:val="22"/>
+              </w:rPr>
+              <w:t xml:space="preserve">Evento</w:t>
+            </w:r>
+          </w:p>
+        </w:tc>
+        <w:tc>
+          <w:tcPr>
+            <w:tcW w:type="dxa" w:w="2000"/>
+            <w:tcBorders>
+              <w:top w:val="single" w:color="CCCCCC" w:sz="1"/>
+              <w:left w:val="single" w:color="CCCCCC" w:sz="1"/>
+              <w:bottom w:val="single" w:color="CCCCCC" w:sz="1"/>
+              <w:right w:val="single" w:color="CCCCCC" w:sz="1"/>
+            </w:tcBorders>
+            <w:shd w:fill="D9E2F3" w:val="clear"/>
+            <w:tcMar>
+              <w:top w:type="dxa" w:w="80"/>
+              <w:left w:type="dxa" w:w="120"/>
+              <w:bottom w:type="dxa" w:w="80"/>
+              <w:right w:type="dxa" w:w="120"/>
+            </w:tcMar>
+            <w:vAlign w:val="center"/>
+          </w:tcPr>
+          <w:p>
+            <w:pPr>
+              <w:jc w:val="left"/>
+            </w:pPr>
+            <w:r>
+              <w:rPr>
+                <w:rFonts w:ascii="Arial" w:cs="Arial" w:eastAsia="Arial" w:hAnsi="Arial"/>
+                <w:b/>
+                <w:bCs/>
+                <w:i w:val="false"/>
+                <w:iCs w:val="false"/>
+                <w:color w:val="000000"/>
+                <w:sz w:val="22"/>
+                <w:szCs w:val="22"/>
+              </w:rPr>
+              <w:t xml:space="preserve">Periodo</w:t>
+            </w:r>
+          </w:p>
+        </w:tc>
+        <w:tc>
+          <w:tcPr>
+            <w:tcW w:type="dxa" w:w="3426"/>
+            <w:tcBorders>
+              <w:top w:val="single" w:color="CCCCCC" w:sz="1"/>
+              <w:left w:val="single" w:color="CCCCCC" w:sz="1"/>
+              <w:bottom w:val="single" w:color="CCCCCC" w:sz="1"/>
+              <w:right w:val="single" w:color="CCCCCC" w:sz="1"/>
+            </w:tcBorders>
+            <w:shd w:fill="D9E2F3" w:val="clear"/>
+            <w:tcMar>
+              <w:top w:type="dxa" w:w="80"/>
+              <w:left w:type="dxa" w:w="120"/>
+              <w:bottom w:type="dxa" w:w="80"/>
+              <w:right w:type="dxa" w:w="120"/>
+            </w:tcMar>
+            <w:vAlign w:val="center"/>
+          </w:tcPr>
+          <w:p>
+            <w:pPr>
+              <w:jc w:val="left"/>
+            </w:pPr>
+            <w:r>
+              <w:rPr>
+                <w:rFonts w:ascii="Arial" w:cs="Arial" w:eastAsia="Arial" w:hAnsi="Arial"/>
+                <w:b/>
+                <w:bCs/>
+                <w:i w:val="false"/>
+                <w:iCs w:val="false"/>
+                <w:color w:val="000000"/>
+                <w:sz w:val="22"/>
+                <w:szCs w:val="22"/>
+              </w:rPr>
+              <w:t xml:space="preserve">Resultado Esperado</w:t>
+            </w:r>
+          </w:p>
+        </w:tc>
+      </w:tr>
+      <w:tr>
+        <w:tc>
+          <w:tcPr>
+            <w:tcW w:type="dxa" w:w="3600"/>
+            <w:tcBorders>
+              <w:top w:val="single" w:color="CCCCCC" w:sz="1"/>
+              <w:left w:val="single" w:color="CCCCCC" w:sz="1"/>
+              <w:bottom w:val="single" w:color="CCCCCC" w:sz="1"/>
+              <w:right w:val="single" w:color="CCCCCC" w:sz="1"/>
+            </w:tcBorders>
+            <w:tcMar>
+              <w:top w:type="dxa" w:w="80"/>
+              <w:left w:type="dxa" w:w="120"/>
+              <w:bottom w:type="dxa" w:w="80"/>
+              <w:right w:type="dxa" w:w="120"/>
+            </w:tcMar>
+          </w:tcPr>
+          <w:p>
+            <w:r>
+              <w:rPr>
+                <w:rFonts w:ascii="Arial" w:cs="Arial" w:eastAsia="Arial" w:hAnsi="Arial"/>
+                <w:b w:val="false"/>
+                <w:bCs w:val="false"/>
+                <w:i w:val="false"/>
+                <w:iCs w:val="false"/>
+                <w:color w:val="000000"/>
+                <w:sz w:val="22"/>
+                <w:szCs w:val="22"/>
+              </w:rPr>
+              <w:t xml:space="preserve">Tempestade Geomagnetica — Maio 2024</w:t>
+            </w:r>
+          </w:p>
+        </w:tc>
+        <w:tc>
+          <w:tcPr>
+            <w:tcW w:type="dxa" w:w="2000"/>
+            <w:tcBorders>
+              <w:top w:val="single" w:color="CCCCCC" w:sz="1"/>
+              <w:left w:val="single" w:color="CCCCCC" w:sz="1"/>
+              <w:bottom w:val="single" w:color="CCCCCC" w:sz="1"/>
+              <w:right w:val="single" w:color="CCCCCC" w:sz="1"/>
+            </w:tcBorders>
+            <w:tcMar>
+              <w:top w:type="dxa" w:w="80"/>
+              <w:left w:type="dxa" w:w="120"/>
+              <w:bottom w:type="dxa" w:w="80"/>
+              <w:right w:type="dxa" w:w="120"/>
+            </w:tcMar>
+          </w:tcPr>
+          <w:p>
+            <w:r>
+              <w:rPr>
+                <w:rFonts w:ascii="Arial" w:cs="Arial" w:eastAsia="Arial" w:hAnsi="Arial"/>
+                <w:b w:val="false"/>
+                <w:bCs w:val="false"/>
+                <w:i w:val="false"/>
+                <w:iCs w:val="false"/>
+                <w:color w:val="000000"/>
+                <w:sz w:val="22"/>
+                <w:szCs w:val="22"/>
+              </w:rPr>
+              <w:t xml:space="preserve">10–13/05/2024</w:t>
+            </w:r>
+          </w:p>
+        </w:tc>
+        <w:tc>
+          <w:tcPr>
+            <w:tcW w:type="dxa" w:w="3426"/>
+            <w:tcBorders>
+              <w:top w:val="single" w:color="CCCCCC" w:sz="1"/>
+              <w:left w:val="single" w:color="CCCCCC" w:sz="1"/>
+              <w:bottom w:val="single" w:color="CCCCCC" w:sz="1"/>
+              <w:right w:val="single" w:color="CCCCCC" w:sz="1"/>
+            </w:tcBorders>
+            <w:tcMar>
+              <w:top w:type="dxa" w:w="80"/>
+              <w:left w:type="dxa" w:w="120"/>
+              <w:bottom w:type="dxa" w:w="80"/>
+              <w:right w:type="dxa" w:w="120"/>
+            </w:tcMar>
+          </w:tcPr>
+          <w:p>
+            <w:r>
+              <w:rPr>
+                <w:rFonts w:ascii="Arial" w:cs="Arial" w:eastAsia="Arial" w:hAnsi="Arial"/>
+                <w:b w:val="false"/>
+                <w:bCs w:val="false"/>
+                <w:i w:val="false"/>
+                <w:iCs w:val="false"/>
+                <w:color w:val="000000"/>
+                <w:sz w:val="22"/>
+                <w:szCs w:val="22"/>
+              </w:rPr>
+              <w:t xml:space="preserve">Score ALTO, Kp ≥ 9, Dst ~ −400 nT</w:t>
+            </w:r>
+          </w:p>
+        </w:tc>
+      </w:tr>
+      <w:tr>
+        <w:tc>
+          <w:tcPr>
+            <w:tcW w:type="dxa" w:w="3600"/>
+            <w:tcBorders>
+              <w:top w:val="single" w:color="CCCCCC" w:sz="1"/>
+              <w:left w:val="single" w:color="CCCCCC" w:sz="1"/>
+              <w:bottom w:val="single" w:color="CCCCCC" w:sz="1"/>
+              <w:right w:val="single" w:color="CCCCCC" w:sz="1"/>
+            </w:tcBorders>
+            <w:tcMar>
+              <w:top w:type="dxa" w:w="80"/>
+              <w:left w:type="dxa" w:w="120"/>
+              <w:bottom w:type="dxa" w:w="80"/>
+              <w:right w:type="dxa" w:w="120"/>
+            </w:tcMar>
+          </w:tcPr>
+          <w:p>
+            <w:r>
+              <w:rPr>
+                <w:rFonts w:ascii="Arial" w:cs="Arial" w:eastAsia="Arial" w:hAnsi="Arial"/>
+                <w:b w:val="false"/>
+                <w:bCs w:val="false"/>
+                <w:i w:val="false"/>
+                <w:iCs w:val="false"/>
+                <w:color w:val="000000"/>
+                <w:sz w:val="22"/>
+                <w:szCs w:val="22"/>
+              </w:rPr>
+              <w:t xml:space="preserve">Tempestade Geomagnetica — Marco 2023</w:t>
+            </w:r>
+          </w:p>
+        </w:tc>
+        <w:tc>
+          <w:tcPr>
+            <w:tcW w:type="dxa" w:w="2000"/>
+            <w:tcBorders>
+              <w:top w:val="single" w:color="CCCCCC" w:sz="1"/>
+              <w:left w:val="single" w:color="CCCCCC" w:sz="1"/>
+              <w:bottom w:val="single" w:color="CCCCCC" w:sz="1"/>
+              <w:right w:val="single" w:color="CCCCCC" w:sz="1"/>
+            </w:tcBorders>
+            <w:tcMar>
+              <w:top w:type="dxa" w:w="80"/>
+              <w:left w:type="dxa" w:w="120"/>
+              <w:bottom w:type="dxa" w:w="80"/>
+              <w:right w:type="dxa" w:w="120"/>
+            </w:tcMar>
+          </w:tcPr>
+          <w:p>
+            <w:r>
+              <w:rPr>
+                <w:rFonts w:ascii="Arial" w:cs="Arial" w:eastAsia="Arial" w:hAnsi="Arial"/>
+                <w:b w:val="false"/>
+                <w:bCs w:val="false"/>
+                <w:i w:val="false"/>
+                <w:iCs w:val="false"/>
+                <w:color w:val="000000"/>
+                <w:sz w:val="22"/>
+                <w:szCs w:val="22"/>
+              </w:rPr>
+              <w:t xml:space="preserve">23–25/03/2023</w:t>
+            </w:r>
+          </w:p>
+        </w:tc>
+        <w:tc>
+          <w:tcPr>
+            <w:tcW w:type="dxa" w:w="3426"/>
+            <w:tcBorders>
+              <w:top w:val="single" w:color="CCCCCC" w:sz="1"/>
+              <w:left w:val="single" w:color="CCCCCC" w:sz="1"/>
+              <w:bottom w:val="single" w:color="CCCCCC" w:sz="1"/>
+              <w:right w:val="single" w:color="CCCCCC" w:sz="1"/>
+            </w:tcBorders>
+            <w:tcMar>
+              <w:top w:type="dxa" w:w="80"/>
+              <w:left w:type="dxa" w:w="120"/>
+              <w:bottom w:type="dxa" w:w="80"/>
+              <w:right w:type="dxa" w:w="120"/>
+            </w:tcMar>
+          </w:tcPr>
+          <w:p>
+            <w:r>
+              <w:rPr>
+                <w:rFonts w:ascii="Arial" w:cs="Arial" w:eastAsia="Arial" w:hAnsi="Arial"/>
+                <w:b w:val="false"/>
+                <w:bCs w:val="false"/>
+                <w:i w:val="false"/>
+                <w:iCs w:val="false"/>
+                <w:color w:val="000000"/>
+                <w:sz w:val="22"/>
+                <w:szCs w:val="22"/>
+              </w:rPr>
+              <w:t xml:space="preserve">Score ALTO, Kp ≥ 7</w:t>
+            </w:r>
+          </w:p>
+        </w:tc>
+      </w:tr>
+      <w:tr>
+        <w:tc>
+          <w:tcPr>
+            <w:tcW w:type="dxa" w:w="3600"/>
+            <w:tcBorders>
+              <w:top w:val="single" w:color="CCCCCC" w:sz="1"/>
+              <w:left w:val="single" w:color="CCCCCC" w:sz="1"/>
+              <w:bottom w:val="single" w:color="CCCCCC" w:sz="1"/>
+              <w:right w:val="single" w:color="CCCCCC" w:sz="1"/>
+            </w:tcBorders>
+            <w:tcMar>
+              <w:top w:type="dxa" w:w="80"/>
+              <w:left w:type="dxa" w:w="120"/>
+              <w:bottom w:type="dxa" w:w="80"/>
+              <w:right w:type="dxa" w:w="120"/>
+            </w:tcMar>
+          </w:tcPr>
+          <w:p>
+            <w:r>
+              <w:rPr>
+                <w:rFonts w:ascii="Arial" w:cs="Arial" w:eastAsia="Arial" w:hAnsi="Arial"/>
+                <w:b w:val="false"/>
+                <w:bCs w:val="false"/>
+                <w:i w:val="false"/>
+                <w:iCs w:val="false"/>
+                <w:color w:val="000000"/>
+                <w:sz w:val="22"/>
+                <w:szCs w:val="22"/>
+              </w:rPr>
+              <w:t xml:space="preserve">Periodo Calmo — Janeiro 2024</w:t>
+            </w:r>
+          </w:p>
+        </w:tc>
+        <w:tc>
+          <w:tcPr>
+            <w:tcW w:type="dxa" w:w="2000"/>
+            <w:tcBorders>
+              <w:top w:val="single" w:color="CCCCCC" w:sz="1"/>
+              <w:left w:val="single" w:color="CCCCCC" w:sz="1"/>
+              <w:bottom w:val="single" w:color="CCCCCC" w:sz="1"/>
+              <w:right w:val="single" w:color="CCCCCC" w:sz="1"/>
+            </w:tcBorders>
+            <w:tcMar>
+              <w:top w:type="dxa" w:w="80"/>
+              <w:left w:type="dxa" w:w="120"/>
+              <w:bottom w:type="dxa" w:w="80"/>
+              <w:right w:type="dxa" w:w="120"/>
+            </w:tcMar>
+          </w:tcPr>
+          <w:p>
+            <w:r>
+              <w:rPr>
+                <w:rFonts w:ascii="Arial" w:cs="Arial" w:eastAsia="Arial" w:hAnsi="Arial"/>
+                <w:b w:val="false"/>
+                <w:bCs w:val="false"/>
+                <w:i w:val="false"/>
+                <w:iCs w:val="false"/>
+                <w:color w:val="000000"/>
+                <w:sz w:val="22"/>
+                <w:szCs w:val="22"/>
+              </w:rPr>
+              <w:t xml:space="preserve">01–08/01/2024</w:t>
+            </w:r>
+          </w:p>
+        </w:tc>
+        <w:tc>
+          <w:tcPr>
+            <w:tcW w:type="dxa" w:w="3426"/>
+            <w:tcBorders>
+              <w:top w:val="single" w:color="CCCCCC" w:sz="1"/>
+              <w:left w:val="single" w:color="CCCCCC" w:sz="1"/>
+              <w:bottom w:val="single" w:color="CCCCCC" w:sz="1"/>
+              <w:right w:val="single" w:color="CCCCCC" w:sz="1"/>
+            </w:tcBorders>
+            <w:tcMar>
+              <w:top w:type="dxa" w:w="80"/>
+              <w:left w:type="dxa" w:w="120"/>
+              <w:bottom w:type="dxa" w:w="80"/>
+              <w:right w:type="dxa" w:w="120"/>
+            </w:tcMar>
+          </w:tcPr>
+          <w:p>
+            <w:r>
+              <w:rPr>
+                <w:rFonts w:ascii="Arial" w:cs="Arial" w:eastAsia="Arial" w:hAnsi="Arial"/>
+                <w:b w:val="false"/>
+                <w:bCs w:val="false"/>
+                <w:i w:val="false"/>
+                <w:iCs w:val="false"/>
+                <w:color w:val="000000"/>
+                <w:sz w:val="22"/>
+                <w:szCs w:val="22"/>
+              </w:rPr>
+              <w:t xml:space="preserve">Score BAIXO</w:t>
+            </w:r>
+          </w:p>
+        </w:tc>
+      </w:tr>
+    </w:tbl>
+    <w:p>
+      <w:pPr>
+        <w:pStyle w:val="Heading2"/>
+        <w:spacing w:after="80" w:before="160"/>
+        <w:jc w:val="left"/>
+      </w:pPr>
+      <w:r>
+        <w:rPr>
+          <w:rFonts w:ascii="Arial" w:cs="Arial" w:eastAsia="Arial" w:hAnsi="Arial"/>
+          <w:b w:val="false"/>
+          <w:bCs w:val="false"/>
+          <w:i w:val="false"/>
+          <w:iCs w:val="false"/>
+          <w:color w:val="000000"/>
+          <w:sz w:val="24"/>
+          <w:szCs w:val="24"/>
+        </w:rPr>
+        <w:t xml:space="preserve">5.3 Resultados</w:t>
+      </w:r>
+    </w:p>
+    <w:tbl>
+      <w:tblPr>
+        <w:tblW w:type="dxa" w:w="9026"/>
+        <w:tblBorders>
+          <w:top w:val="single" w:color="auto" w:sz="4"/>
+          <w:left w:val="single" w:color="auto" w:sz="4"/>
+          <w:bottom w:val="single" w:color="auto" w:sz="4"/>
+          <w:right w:val="single" w:color="auto" w:sz="4"/>
+          <w:insideH w:val="single" w:color="auto" w:sz="4"/>
+          <w:insideV w:val="single" w:color="auto" w:sz="4"/>
+        </w:tblBorders>
+      </w:tblPr>
+      <w:tblGrid>
+        <w:gridCol w:w="2400"/>
+        <w:gridCol w:w="1100"/>
+        <w:gridCol w:w="1100"/>
+        <w:gridCol w:w="1100"/>
+        <w:gridCol w:w="1100"/>
+        <w:gridCol w:w="2226"/>
+      </w:tblGrid>
+      <w:tr>
+        <w:trPr>
+          <w:tblHeader/>
+        </w:trPr>
+        <w:tc>
+          <w:tcPr>
+            <w:tcW w:type="dxa" w:w="2400"/>
+            <w:tcBorders>
+              <w:top w:val="single" w:color="CCCCCC" w:sz="1"/>
+              <w:left w:val="single" w:color="CCCCCC" w:sz="1"/>
+              <w:bottom w:val="single" w:color="CCCCCC" w:sz="1"/>
+              <w:right w:val="single" w:color="CCCCCC" w:sz="1"/>
+            </w:tcBorders>
+            <w:shd w:fill="D9E2F3" w:val="clear"/>
+            <w:tcMar>
+              <w:top w:type="dxa" w:w="80"/>
+              <w:left w:type="dxa" w:w="120"/>
+              <w:bottom w:type="dxa" w:w="80"/>
+              <w:right w:type="dxa" w:w="120"/>
+            </w:tcMar>
+            <w:vAlign w:val="center"/>
+          </w:tcPr>
+          <w:p>
+            <w:pPr>
+              <w:jc w:val="left"/>
+            </w:pPr>
+            <w:r>
+              <w:rPr>
+                <w:rFonts w:ascii="Arial" w:cs="Arial" w:eastAsia="Arial" w:hAnsi="Arial"/>
+                <w:b/>
+                <w:bCs/>
+                <w:i w:val="false"/>
+                <w:iCs w:val="false"/>
+                <w:color w:val="000000"/>
+                <w:sz w:val="22"/>
+                <w:szCs w:val="22"/>
+              </w:rPr>
+              <w:t xml:space="preserve">Evento</w:t>
+            </w:r>
+          </w:p>
+        </w:tc>
+        <w:tc>
+          <w:tcPr>
+            <w:tcW w:type="dxa" w:w="1100"/>
+            <w:tcBorders>
+              <w:top w:val="single" w:color="CCCCCC" w:sz="1"/>
+              <w:left w:val="single" w:color="CCCCCC" w:sz="1"/>
+              <w:bottom w:val="single" w:color="CCCCCC" w:sz="1"/>
+              <w:right w:val="single" w:color="CCCCCC" w:sz="1"/>
+            </w:tcBorders>
+            <w:shd w:fill="D9E2F3" w:val="clear"/>
+            <w:tcMar>
+              <w:top w:type="dxa" w:w="80"/>
+              <w:left w:type="dxa" w:w="120"/>
+              <w:bottom w:type="dxa" w:w="80"/>
+              <w:right w:type="dxa" w:w="120"/>
+            </w:tcMar>
+            <w:vAlign w:val="center"/>
+          </w:tcPr>
+          <w:p>
+            <w:pPr>
+              <w:jc w:val="center"/>
+            </w:pPr>
+            <w:r>
+              <w:rPr>
+                <w:rFonts w:ascii="Arial" w:cs="Arial" w:eastAsia="Arial" w:hAnsi="Arial"/>
+                <w:b/>
+                <w:bCs/>
+                <w:i w:val="false"/>
+                <w:iCs w:val="false"/>
+                <w:color w:val="000000"/>
+                <w:sz w:val="22"/>
+                <w:szCs w:val="22"/>
+              </w:rPr>
+              <w:t xml:space="preserve">Score Max</w:t>
+            </w:r>
+          </w:p>
+        </w:tc>
+        <w:tc>
+          <w:tcPr>
+            <w:tcW w:type="dxa" w:w="1100"/>
+            <w:tcBorders>
+              <w:top w:val="single" w:color="CCCCCC" w:sz="1"/>
+              <w:left w:val="single" w:color="CCCCCC" w:sz="1"/>
+              <w:bottom w:val="single" w:color="CCCCCC" w:sz="1"/>
+              <w:right w:val="single" w:color="CCCCCC" w:sz="1"/>
+            </w:tcBorders>
+            <w:shd w:fill="D9E2F3" w:val="clear"/>
+            <w:tcMar>
+              <w:top w:type="dxa" w:w="80"/>
+              <w:left w:type="dxa" w:w="120"/>
+              <w:bottom w:type="dxa" w:w="80"/>
+              <w:right w:type="dxa" w:w="120"/>
+            </w:tcMar>
+            <w:vAlign w:val="center"/>
+          </w:tcPr>
+          <w:p>
+            <w:pPr>
+              <w:jc w:val="center"/>
+            </w:pPr>
+            <w:r>
+              <w:rPr>
+                <w:rFonts w:ascii="Arial" w:cs="Arial" w:eastAsia="Arial" w:hAnsi="Arial"/>
+                <w:b/>
+                <w:bCs/>
+                <w:i w:val="false"/>
+                <w:iCs w:val="false"/>
+                <w:color w:val="000000"/>
+                <w:sz w:val="22"/>
+                <w:szCs w:val="22"/>
+              </w:rPr>
+              <w:t xml:space="preserve">% ALTO</w:t>
+            </w:r>
+          </w:p>
+        </w:tc>
+        <w:tc>
+          <w:tcPr>
+            <w:tcW w:type="dxa" w:w="1100"/>
+            <w:tcBorders>
+              <w:top w:val="single" w:color="CCCCCC" w:sz="1"/>
+              <w:left w:val="single" w:color="CCCCCC" w:sz="1"/>
+              <w:bottom w:val="single" w:color="CCCCCC" w:sz="1"/>
+              <w:right w:val="single" w:color="CCCCCC" w:sz="1"/>
+            </w:tcBorders>
+            <w:shd w:fill="D9E2F3" w:val="clear"/>
+            <w:tcMar>
+              <w:top w:type="dxa" w:w="80"/>
+              <w:left w:type="dxa" w:w="120"/>
+              <w:bottom w:type="dxa" w:w="80"/>
+              <w:right w:type="dxa" w:w="120"/>
+            </w:tcMar>
+            <w:vAlign w:val="center"/>
+          </w:tcPr>
+          <w:p>
+            <w:pPr>
+              <w:jc w:val="center"/>
+            </w:pPr>
+            <w:r>
+              <w:rPr>
+                <w:rFonts w:ascii="Arial" w:cs="Arial" w:eastAsia="Arial" w:hAnsi="Arial"/>
+                <w:b/>
+                <w:bCs/>
+                <w:i w:val="false"/>
+                <w:iCs w:val="false"/>
+                <w:color w:val="000000"/>
+                <w:sz w:val="22"/>
+                <w:szCs w:val="22"/>
+              </w:rPr>
+              <w:t xml:space="preserve">% MEDIO</w:t>
+            </w:r>
+          </w:p>
+        </w:tc>
+        <w:tc>
+          <w:tcPr>
+            <w:tcW w:type="dxa" w:w="1100"/>
+            <w:tcBorders>
+              <w:top w:val="single" w:color="CCCCCC" w:sz="1"/>
+              <w:left w:val="single" w:color="CCCCCC" w:sz="1"/>
+              <w:bottom w:val="single" w:color="CCCCCC" w:sz="1"/>
+              <w:right w:val="single" w:color="CCCCCC" w:sz="1"/>
+            </w:tcBorders>
+            <w:shd w:fill="D9E2F3" w:val="clear"/>
+            <w:tcMar>
+              <w:top w:type="dxa" w:w="80"/>
+              <w:left w:type="dxa" w:w="120"/>
+              <w:bottom w:type="dxa" w:w="80"/>
+              <w:right w:type="dxa" w:w="120"/>
+            </w:tcMar>
+            <w:vAlign w:val="center"/>
+          </w:tcPr>
+          <w:p>
+            <w:pPr>
+              <w:jc w:val="center"/>
+            </w:pPr>
+            <w:r>
+              <w:rPr>
+                <w:rFonts w:ascii="Arial" w:cs="Arial" w:eastAsia="Arial" w:hAnsi="Arial"/>
+                <w:b/>
+                <w:bCs/>
+                <w:i w:val="false"/>
+                <w:iCs w:val="false"/>
+                <w:color w:val="000000"/>
+                <w:sz w:val="22"/>
+                <w:szCs w:val="22"/>
+              </w:rPr>
+              <w:t xml:space="preserve">% BAIXO</w:t>
+            </w:r>
+          </w:p>
+        </w:tc>
+        <w:tc>
+          <w:tcPr>
+            <w:tcW w:type="dxa" w:w="2226"/>
+            <w:tcBorders>
+              <w:top w:val="single" w:color="CCCCCC" w:sz="1"/>
+              <w:left w:val="single" w:color="CCCCCC" w:sz="1"/>
+              <w:bottom w:val="single" w:color="CCCCCC" w:sz="1"/>
+              <w:right w:val="single" w:color="CCCCCC" w:sz="1"/>
+            </w:tcBorders>
+            <w:shd w:fill="D9E2F3" w:val="clear"/>
+            <w:tcMar>
+              <w:top w:type="dxa" w:w="80"/>
+              <w:left w:type="dxa" w:w="120"/>
+              <w:bottom w:type="dxa" w:w="80"/>
+              <w:right w:type="dxa" w:w="120"/>
+            </w:tcMar>
+            <w:vAlign w:val="center"/>
+          </w:tcPr>
+          <w:p>
+            <w:pPr>
+              <w:jc w:val="center"/>
+            </w:pPr>
+            <w:r>
+              <w:rPr>
+                <w:rFonts w:ascii="Arial" w:cs="Arial" w:eastAsia="Arial" w:hAnsi="Arial"/>
+                <w:b/>
+                <w:bCs/>
+                <w:i w:val="false"/>
+                <w:iCs w:val="false"/>
+                <w:color w:val="000000"/>
+                <w:sz w:val="22"/>
+                <w:szCs w:val="22"/>
+              </w:rPr>
+              <w:t xml:space="preserve">Veredito</w:t>
+            </w:r>
+          </w:p>
+        </w:tc>
+      </w:tr>
+      <w:tr>
+        <w:tc>
+          <w:tcPr>
+            <w:tcW w:type="dxa" w:w="2400"/>
+            <w:tcBorders>
+              <w:top w:val="single" w:color="CCCCCC" w:sz="1"/>
+              <w:left w:val="single" w:color="CCCCCC" w:sz="1"/>
+              <w:bottom w:val="single" w:color="CCCCCC" w:sz="1"/>
+              <w:right w:val="single" w:color="CCCCCC" w:sz="1"/>
+            </w:tcBorders>
+            <w:tcMar>
+              <w:top w:type="dxa" w:w="80"/>
+              <w:left w:type="dxa" w:w="120"/>
+              <w:bottom w:type="dxa" w:w="80"/>
+              <w:right w:type="dxa" w:w="120"/>
+            </w:tcMar>
+          </w:tcPr>
+          <w:p>
+            <w:r>
+              <w:rPr>
+                <w:rFonts w:ascii="Arial" w:cs="Arial" w:eastAsia="Arial" w:hAnsi="Arial"/>
+                <w:b w:val="false"/>
+                <w:bCs w:val="false"/>
+                <w:i w:val="false"/>
+                <w:iCs w:val="false"/>
+                <w:color w:val="000000"/>
+                <w:sz w:val="22"/>
+                <w:szCs w:val="22"/>
+              </w:rPr>
+              <w:t xml:space="preserve">Tempestade Maio 2024</w:t>
+            </w:r>
+          </w:p>
+        </w:tc>
+        <w:tc>
+          <w:tcPr>
+            <w:tcW w:type="dxa" w:w="1100"/>
+            <w:tcBorders>
+              <w:top w:val="single" w:color="CCCCCC" w:sz="1"/>
+              <w:left w:val="single" w:color="CCCCCC" w:sz="1"/>
+              <w:bottom w:val="single" w:color="CCCCCC" w:sz="1"/>
+              <w:right w:val="single" w:color="CCCCCC" w:sz="1"/>
+            </w:tcBorders>
+            <w:tcMar>
+              <w:top w:type="dxa" w:w="80"/>
+              <w:left w:type="dxa" w:w="120"/>
+              <w:bottom w:type="dxa" w:w="80"/>
+              <w:right w:type="dxa" w:w="120"/>
+            </w:tcMar>
+          </w:tcPr>
+          <w:p>
+            <w:pPr>
+              <w:jc w:val="center"/>
+            </w:pPr>
+            <w:r>
+              <w:rPr>
+                <w:rFonts w:ascii="Arial" w:cs="Arial" w:eastAsia="Arial" w:hAnsi="Arial"/>
+                <w:b w:val="false"/>
+                <w:bCs w:val="false"/>
+                <w:i w:val="false"/>
+                <w:iCs w:val="false"/>
+                <w:color w:val="000000"/>
+                <w:sz w:val="22"/>
+                <w:szCs w:val="22"/>
+              </w:rPr>
+              <w:t xml:space="preserve">0.9260</w:t>
+            </w:r>
+          </w:p>
+        </w:tc>
+        <w:tc>
+          <w:tcPr>
+            <w:tcW w:type="dxa" w:w="1100"/>
+            <w:tcBorders>
+              <w:top w:val="single" w:color="CCCCCC" w:sz="1"/>
+              <w:left w:val="single" w:color="CCCCCC" w:sz="1"/>
+              <w:bottom w:val="single" w:color="CCCCCC" w:sz="1"/>
+              <w:right w:val="single" w:color="CCCCCC" w:sz="1"/>
+            </w:tcBorders>
+            <w:tcMar>
+              <w:top w:type="dxa" w:w="80"/>
+              <w:left w:type="dxa" w:w="120"/>
+              <w:bottom w:type="dxa" w:w="80"/>
+              <w:right w:type="dxa" w:w="120"/>
+            </w:tcMar>
+          </w:tcPr>
+          <w:p>
+            <w:pPr>
+              <w:jc w:val="center"/>
+            </w:pPr>
+            <w:r>
+              <w:rPr>
+                <w:rFonts w:ascii="Arial" w:cs="Arial" w:eastAsia="Arial" w:hAnsi="Arial"/>
+                <w:b w:val="false"/>
+                <w:bCs w:val="false"/>
+                <w:i w:val="false"/>
+                <w:iCs w:val="false"/>
+                <w:color w:val="000000"/>
+                <w:sz w:val="22"/>
+                <w:szCs w:val="22"/>
+              </w:rPr>
+              <w:t xml:space="preserve">43.8%</w:t>
+            </w:r>
+          </w:p>
+        </w:tc>
+        <w:tc>
+          <w:tcPr>
+            <w:tcW w:type="dxa" w:w="1100"/>
+            <w:tcBorders>
+              <w:top w:val="single" w:color="CCCCCC" w:sz="1"/>
+              <w:left w:val="single" w:color="CCCCCC" w:sz="1"/>
+              <w:bottom w:val="single" w:color="CCCCCC" w:sz="1"/>
+              <w:right w:val="single" w:color="CCCCCC" w:sz="1"/>
+            </w:tcBorders>
+            <w:tcMar>
+              <w:top w:type="dxa" w:w="80"/>
+              <w:left w:type="dxa" w:w="120"/>
+              <w:bottom w:type="dxa" w:w="80"/>
+              <w:right w:type="dxa" w:w="120"/>
+            </w:tcMar>
+          </w:tcPr>
+          <w:p>
+            <w:pPr>
+              <w:jc w:val="center"/>
+            </w:pPr>
+            <w:r>
+              <w:rPr>
+                <w:rFonts w:ascii="Arial" w:cs="Arial" w:eastAsia="Arial" w:hAnsi="Arial"/>
+                <w:b w:val="false"/>
+                <w:bCs w:val="false"/>
+                <w:i w:val="false"/>
+                <w:iCs w:val="false"/>
+                <w:color w:val="000000"/>
+                <w:sz w:val="22"/>
+                <w:szCs w:val="22"/>
+              </w:rPr>
+              <w:t xml:space="preserve">50.0%</w:t>
+            </w:r>
+          </w:p>
+        </w:tc>
+        <w:tc>
+          <w:tcPr>
+            <w:tcW w:type="dxa" w:w="1100"/>
+            <w:tcBorders>
+              <w:top w:val="single" w:color="CCCCCC" w:sz="1"/>
+              <w:left w:val="single" w:color="CCCCCC" w:sz="1"/>
+              <w:bottom w:val="single" w:color="CCCCCC" w:sz="1"/>
+              <w:right w:val="single" w:color="CCCCCC" w:sz="1"/>
+            </w:tcBorders>
+            <w:tcMar>
+              <w:top w:type="dxa" w:w="80"/>
+              <w:left w:type="dxa" w:w="120"/>
+              <w:bottom w:type="dxa" w:w="80"/>
+              <w:right w:type="dxa" w:w="120"/>
+            </w:tcMar>
+          </w:tcPr>
+          <w:p>
+            <w:pPr>
+              <w:jc w:val="center"/>
+            </w:pPr>
+            <w:r>
+              <w:rPr>
+                <w:rFonts w:ascii="Arial" w:cs="Arial" w:eastAsia="Arial" w:hAnsi="Arial"/>
+                <w:b w:val="false"/>
+                <w:bCs w:val="false"/>
+                <w:i w:val="false"/>
+                <w:iCs w:val="false"/>
+                <w:color w:val="000000"/>
+                <w:sz w:val="22"/>
+                <w:szCs w:val="22"/>
+              </w:rPr>
+              <w:t xml:space="preserve">6.2%</w:t>
+            </w:r>
+          </w:p>
+        </w:tc>
+        <w:tc>
+          <w:tcPr>
+            <w:tcW w:type="dxa" w:w="2226"/>
+            <w:tcBorders>
+              <w:top w:val="single" w:color="CCCCCC" w:sz="1"/>
+              <w:left w:val="single" w:color="CCCCCC" w:sz="1"/>
+              <w:bottom w:val="single" w:color="CCCCCC" w:sz="1"/>
+              <w:right w:val="single" w:color="CCCCCC" w:sz="1"/>
+            </w:tcBorders>
+            <w:tcMar>
+              <w:top w:type="dxa" w:w="80"/>
+              <w:left w:type="dxa" w:w="120"/>
+              <w:bottom w:type="dxa" w:w="80"/>
+              <w:right w:type="dxa" w:w="120"/>
+            </w:tcMar>
+          </w:tcPr>
+          <w:p>
+            <w:pPr>
+              <w:jc w:val="center"/>
+            </w:pPr>
+            <w:r>
+              <w:rPr>
+                <w:rFonts w:ascii="Arial" w:cs="Arial" w:eastAsia="Arial" w:hAnsi="Arial"/>
+                <w:b w:val="false"/>
+                <w:bCs w:val="false"/>
+                <w:i w:val="false"/>
+                <w:iCs w:val="false"/>
+                <w:color w:val="000000"/>
+                <w:sz w:val="22"/>
+                <w:szCs w:val="22"/>
+              </w:rPr>
+              <w:t xml:space="preserve">Aprovado</w:t>
+            </w:r>
+          </w:p>
+        </w:tc>
+      </w:tr>
+      <w:tr>
+        <w:tc>
+          <w:tcPr>
+            <w:tcW w:type="dxa" w:w="2400"/>
+            <w:tcBorders>
+              <w:top w:val="single" w:color="CCCCCC" w:sz="1"/>
+              <w:left w:val="single" w:color="CCCCCC" w:sz="1"/>
+              <w:bottom w:val="single" w:color="CCCCCC" w:sz="1"/>
+              <w:right w:val="single" w:color="CCCCCC" w:sz="1"/>
+            </w:tcBorders>
+            <w:tcMar>
+              <w:top w:type="dxa" w:w="80"/>
+              <w:left w:type="dxa" w:w="120"/>
+              <w:bottom w:type="dxa" w:w="80"/>
+              <w:right w:type="dxa" w:w="120"/>
+            </w:tcMar>
+          </w:tcPr>
+          <w:p>
+            <w:r>
+              <w:rPr>
+                <w:rFonts w:ascii="Arial" w:cs="Arial" w:eastAsia="Arial" w:hAnsi="Arial"/>
+                <w:b w:val="false"/>
+                <w:bCs w:val="false"/>
+                <w:i w:val="false"/>
+                <w:iCs w:val="false"/>
+                <w:color w:val="000000"/>
+                <w:sz w:val="22"/>
+                <w:szCs w:val="22"/>
+              </w:rPr>
+              <w:t xml:space="preserve">Tempestade Marco 2023</w:t>
+            </w:r>
+          </w:p>
+        </w:tc>
+        <w:tc>
+          <w:tcPr>
+            <w:tcW w:type="dxa" w:w="1100"/>
+            <w:tcBorders>
+              <w:top w:val="single" w:color="CCCCCC" w:sz="1"/>
+              <w:left w:val="single" w:color="CCCCCC" w:sz="1"/>
+              <w:bottom w:val="single" w:color="CCCCCC" w:sz="1"/>
+              <w:right w:val="single" w:color="CCCCCC" w:sz="1"/>
+            </w:tcBorders>
+            <w:tcMar>
+              <w:top w:type="dxa" w:w="80"/>
+              <w:left w:type="dxa" w:w="120"/>
+              <w:bottom w:type="dxa" w:w="80"/>
+              <w:right w:type="dxa" w:w="120"/>
+            </w:tcMar>
+          </w:tcPr>
+          <w:p>
+            <w:pPr>
+              <w:jc w:val="center"/>
+            </w:pPr>
+            <w:r>
+              <w:rPr>
+                <w:rFonts w:ascii="Arial" w:cs="Arial" w:eastAsia="Arial" w:hAnsi="Arial"/>
+                <w:b w:val="false"/>
+                <w:bCs w:val="false"/>
+                <w:i w:val="false"/>
+                <w:iCs w:val="false"/>
+                <w:color w:val="000000"/>
+                <w:sz w:val="22"/>
+                <w:szCs w:val="22"/>
+              </w:rPr>
+              <w:t xml:space="preserve">0.7535</w:t>
+            </w:r>
+          </w:p>
+        </w:tc>
+        <w:tc>
+          <w:tcPr>
+            <w:tcW w:type="dxa" w:w="1100"/>
+            <w:tcBorders>
+              <w:top w:val="single" w:color="CCCCCC" w:sz="1"/>
+              <w:left w:val="single" w:color="CCCCCC" w:sz="1"/>
+              <w:bottom w:val="single" w:color="CCCCCC" w:sz="1"/>
+              <w:right w:val="single" w:color="CCCCCC" w:sz="1"/>
+            </w:tcBorders>
+            <w:tcMar>
+              <w:top w:type="dxa" w:w="80"/>
+              <w:left w:type="dxa" w:w="120"/>
+              <w:bottom w:type="dxa" w:w="80"/>
+              <w:right w:type="dxa" w:w="120"/>
+            </w:tcMar>
+          </w:tcPr>
+          <w:p>
+            <w:pPr>
+              <w:jc w:val="center"/>
+            </w:pPr>
+            <w:r>
+              <w:rPr>
+                <w:rFonts w:ascii="Arial" w:cs="Arial" w:eastAsia="Arial" w:hAnsi="Arial"/>
+                <w:b w:val="false"/>
+                <w:bCs w:val="false"/>
+                <w:i w:val="false"/>
+                <w:iCs w:val="false"/>
+                <w:color w:val="000000"/>
+                <w:sz w:val="22"/>
+                <w:szCs w:val="22"/>
+              </w:rPr>
+              <w:t xml:space="preserve">16.7%</w:t>
+            </w:r>
+          </w:p>
+        </w:tc>
+        <w:tc>
+          <w:tcPr>
+            <w:tcW w:type="dxa" w:w="1100"/>
+            <w:tcBorders>
+              <w:top w:val="single" w:color="CCCCCC" w:sz="1"/>
+              <w:left w:val="single" w:color="CCCCCC" w:sz="1"/>
+              <w:bottom w:val="single" w:color="CCCCCC" w:sz="1"/>
+              <w:right w:val="single" w:color="CCCCCC" w:sz="1"/>
+            </w:tcBorders>
+            <w:tcMar>
+              <w:top w:type="dxa" w:w="80"/>
+              <w:left w:type="dxa" w:w="120"/>
+              <w:bottom w:type="dxa" w:w="80"/>
+              <w:right w:type="dxa" w:w="120"/>
+            </w:tcMar>
+          </w:tcPr>
+          <w:p>
+            <w:pPr>
+              <w:jc w:val="center"/>
+            </w:pPr>
+            <w:r>
+              <w:rPr>
+                <w:rFonts w:ascii="Arial" w:cs="Arial" w:eastAsia="Arial" w:hAnsi="Arial"/>
+                <w:b w:val="false"/>
+                <w:bCs w:val="false"/>
+                <w:i w:val="false"/>
+                <w:iCs w:val="false"/>
+                <w:color w:val="000000"/>
+                <w:sz w:val="22"/>
+                <w:szCs w:val="22"/>
+              </w:rPr>
+              <w:t xml:space="preserve">62.5%</w:t>
+            </w:r>
+          </w:p>
+        </w:tc>
+        <w:tc>
+          <w:tcPr>
+            <w:tcW w:type="dxa" w:w="1100"/>
+            <w:tcBorders>
+              <w:top w:val="single" w:color="CCCCCC" w:sz="1"/>
+              <w:left w:val="single" w:color="CCCCCC" w:sz="1"/>
+              <w:bottom w:val="single" w:color="CCCCCC" w:sz="1"/>
+              <w:right w:val="single" w:color="CCCCCC" w:sz="1"/>
+            </w:tcBorders>
+            <w:tcMar>
+              <w:top w:type="dxa" w:w="80"/>
+              <w:left w:type="dxa" w:w="120"/>
+              <w:bottom w:type="dxa" w:w="80"/>
+              <w:right w:type="dxa" w:w="120"/>
+            </w:tcMar>
+          </w:tcPr>
+          <w:p>
+            <w:pPr>
+              <w:jc w:val="center"/>
+            </w:pPr>
+            <w:r>
+              <w:rPr>
+                <w:rFonts w:ascii="Arial" w:cs="Arial" w:eastAsia="Arial" w:hAnsi="Arial"/>
+                <w:b w:val="false"/>
+                <w:bCs w:val="false"/>
+                <w:i w:val="false"/>
+                <w:iCs w:val="false"/>
+                <w:color w:val="000000"/>
+                <w:sz w:val="22"/>
+                <w:szCs w:val="22"/>
+              </w:rPr>
+              <w:t xml:space="preserve">20.8%</w:t>
+            </w:r>
+          </w:p>
+        </w:tc>
+        <w:tc>
+          <w:tcPr>
+            <w:tcW w:type="dxa" w:w="2226"/>
+            <w:tcBorders>
+              <w:top w:val="single" w:color="CCCCCC" w:sz="1"/>
+              <w:left w:val="single" w:color="CCCCCC" w:sz="1"/>
+              <w:bottom w:val="single" w:color="CCCCCC" w:sz="1"/>
+              <w:right w:val="single" w:color="CCCCCC" w:sz="1"/>
+            </w:tcBorders>
+            <w:tcMar>
+              <w:top w:type="dxa" w:w="80"/>
+              <w:left w:type="dxa" w:w="120"/>
+              <w:bottom w:type="dxa" w:w="80"/>
+              <w:right w:type="dxa" w:w="120"/>
+            </w:tcMar>
+          </w:tcPr>
+          <w:p>
+            <w:pPr>
+              <w:jc w:val="center"/>
+            </w:pPr>
+            <w:r>
+              <w:rPr>
+                <w:rFonts w:ascii="Arial" w:cs="Arial" w:eastAsia="Arial" w:hAnsi="Arial"/>
+                <w:b w:val="false"/>
+                <w:bCs w:val="false"/>
+                <w:i w:val="false"/>
+                <w:iCs w:val="false"/>
+                <w:color w:val="000000"/>
+                <w:sz w:val="22"/>
+                <w:szCs w:val="22"/>
+              </w:rPr>
+              <w:t xml:space="preserve">Aprovado</w:t>
+            </w:r>
+          </w:p>
+        </w:tc>
+      </w:tr>
+      <w:tr>
+        <w:tc>
+          <w:tcPr>
+            <w:tcW w:type="dxa" w:w="2400"/>
+            <w:tcBorders>
+              <w:top w:val="single" w:color="CCCCCC" w:sz="1"/>
+              <w:left w:val="single" w:color="CCCCCC" w:sz="1"/>
+              <w:bottom w:val="single" w:color="CCCCCC" w:sz="1"/>
+              <w:right w:val="single" w:color="CCCCCC" w:sz="1"/>
+            </w:tcBorders>
+            <w:tcMar>
+              <w:top w:type="dxa" w:w="80"/>
+              <w:left w:type="dxa" w:w="120"/>
+              <w:bottom w:type="dxa" w:w="80"/>
+              <w:right w:type="dxa" w:w="120"/>
+            </w:tcMar>
+          </w:tcPr>
+          <w:p>
+            <w:r>
+              <w:rPr>
+                <w:rFonts w:ascii="Arial" w:cs="Arial" w:eastAsia="Arial" w:hAnsi="Arial"/>
+                <w:b w:val="false"/>
+                <w:bCs w:val="false"/>
+                <w:i w:val="false"/>
+                <w:iCs w:val="false"/>
+                <w:color w:val="000000"/>
+                <w:sz w:val="22"/>
+                <w:szCs w:val="22"/>
+              </w:rPr>
+              <w:t xml:space="preserve">Periodo Calmo Jan 2024</w:t>
+            </w:r>
+          </w:p>
+        </w:tc>
+        <w:tc>
+          <w:tcPr>
+            <w:tcW w:type="dxa" w:w="1100"/>
+            <w:tcBorders>
+              <w:top w:val="single" w:color="CCCCCC" w:sz="1"/>
+              <w:left w:val="single" w:color="CCCCCC" w:sz="1"/>
+              <w:bottom w:val="single" w:color="CCCCCC" w:sz="1"/>
+              <w:right w:val="single" w:color="CCCCCC" w:sz="1"/>
+            </w:tcBorders>
+            <w:tcMar>
+              <w:top w:type="dxa" w:w="80"/>
+              <w:left w:type="dxa" w:w="120"/>
+              <w:bottom w:type="dxa" w:w="80"/>
+              <w:right w:type="dxa" w:w="120"/>
+            </w:tcMar>
+          </w:tcPr>
+          <w:p>
+            <w:pPr>
+              <w:jc w:val="center"/>
+            </w:pPr>
+            <w:r>
+              <w:rPr>
+                <w:rFonts w:ascii="Arial" w:cs="Arial" w:eastAsia="Arial" w:hAnsi="Arial"/>
+                <w:b w:val="false"/>
+                <w:bCs w:val="false"/>
+                <w:i w:val="false"/>
+                <w:iCs w:val="false"/>
+                <w:color w:val="000000"/>
+                <w:sz w:val="22"/>
+                <w:szCs w:val="22"/>
+              </w:rPr>
+              <w:t xml:space="preserve">0.3168</w:t>
+            </w:r>
+          </w:p>
+        </w:tc>
+        <w:tc>
+          <w:tcPr>
+            <w:tcW w:type="dxa" w:w="1100"/>
+            <w:tcBorders>
+              <w:top w:val="single" w:color="CCCCCC" w:sz="1"/>
+              <w:left w:val="single" w:color="CCCCCC" w:sz="1"/>
+              <w:bottom w:val="single" w:color="CCCCCC" w:sz="1"/>
+              <w:right w:val="single" w:color="CCCCCC" w:sz="1"/>
+            </w:tcBorders>
+            <w:tcMar>
+              <w:top w:type="dxa" w:w="80"/>
+              <w:left w:type="dxa" w:w="120"/>
+              <w:bottom w:type="dxa" w:w="80"/>
+              <w:right w:type="dxa" w:w="120"/>
+            </w:tcMar>
+          </w:tcPr>
+          <w:p>
+            <w:pPr>
+              <w:jc w:val="center"/>
+            </w:pPr>
+            <w:r>
+              <w:rPr>
+                <w:rFonts w:ascii="Arial" w:cs="Arial" w:eastAsia="Arial" w:hAnsi="Arial"/>
+                <w:b w:val="false"/>
+                <w:bCs w:val="false"/>
+                <w:i w:val="false"/>
+                <w:iCs w:val="false"/>
+                <w:color w:val="000000"/>
+                <w:sz w:val="22"/>
+                <w:szCs w:val="22"/>
+              </w:rPr>
+              <w:t xml:space="preserve">0.0%</w:t>
+            </w:r>
+          </w:p>
+        </w:tc>
+        <w:tc>
+          <w:tcPr>
+            <w:tcW w:type="dxa" w:w="1100"/>
+            <w:tcBorders>
+              <w:top w:val="single" w:color="CCCCCC" w:sz="1"/>
+              <w:left w:val="single" w:color="CCCCCC" w:sz="1"/>
+              <w:bottom w:val="single" w:color="CCCCCC" w:sz="1"/>
+              <w:right w:val="single" w:color="CCCCCC" w:sz="1"/>
+            </w:tcBorders>
+            <w:tcMar>
+              <w:top w:type="dxa" w:w="80"/>
+              <w:left w:type="dxa" w:w="120"/>
+              <w:bottom w:type="dxa" w:w="80"/>
+              <w:right w:type="dxa" w:w="120"/>
+            </w:tcMar>
+          </w:tcPr>
+          <w:p>
+            <w:pPr>
+              <w:jc w:val="center"/>
+            </w:pPr>
+            <w:r>
+              <w:rPr>
+                <w:rFonts w:ascii="Arial" w:cs="Arial" w:eastAsia="Arial" w:hAnsi="Arial"/>
+                <w:b w:val="false"/>
+                <w:bCs w:val="false"/>
+                <w:i w:val="false"/>
+                <w:iCs w:val="false"/>
+                <w:color w:val="000000"/>
+                <w:sz w:val="22"/>
+                <w:szCs w:val="22"/>
+              </w:rPr>
+              <w:t xml:space="preserve">1.6%</w:t>
+            </w:r>
+          </w:p>
+        </w:tc>
+        <w:tc>
+          <w:tcPr>
+            <w:tcW w:type="dxa" w:w="1100"/>
+            <w:tcBorders>
+              <w:top w:val="single" w:color="CCCCCC" w:sz="1"/>
+              <w:left w:val="single" w:color="CCCCCC" w:sz="1"/>
+              <w:bottom w:val="single" w:color="CCCCCC" w:sz="1"/>
+              <w:right w:val="single" w:color="CCCCCC" w:sz="1"/>
+            </w:tcBorders>
+            <w:tcMar>
+              <w:top w:type="dxa" w:w="80"/>
+              <w:left w:type="dxa" w:w="120"/>
+              <w:bottom w:type="dxa" w:w="80"/>
+              <w:right w:type="dxa" w:w="120"/>
+            </w:tcMar>
+          </w:tcPr>
+          <w:p>
+            <w:pPr>
+              <w:jc w:val="center"/>
+            </w:pPr>
+            <w:r>
+              <w:rPr>
+                <w:rFonts w:ascii="Arial" w:cs="Arial" w:eastAsia="Arial" w:hAnsi="Arial"/>
+                <w:b w:val="false"/>
+                <w:bCs w:val="false"/>
+                <w:i w:val="false"/>
+                <w:iCs w:val="false"/>
+                <w:color w:val="000000"/>
+                <w:sz w:val="22"/>
+                <w:szCs w:val="22"/>
+              </w:rPr>
+              <w:t xml:space="preserve">98.4%</w:t>
+            </w:r>
+          </w:p>
+        </w:tc>
+        <w:tc>
+          <w:tcPr>
+            <w:tcW w:type="dxa" w:w="2226"/>
+            <w:tcBorders>
+              <w:top w:val="single" w:color="CCCCCC" w:sz="1"/>
+              <w:left w:val="single" w:color="CCCCCC" w:sz="1"/>
+              <w:bottom w:val="single" w:color="CCCCCC" w:sz="1"/>
+              <w:right w:val="single" w:color="CCCCCC" w:sz="1"/>
+            </w:tcBorders>
+            <w:tcMar>
+              <w:top w:type="dxa" w:w="80"/>
+              <w:left w:type="dxa" w:w="120"/>
+              <w:bottom w:type="dxa" w:w="80"/>
+              <w:right w:type="dxa" w:w="120"/>
+            </w:tcMar>
+          </w:tcPr>
+          <w:p>
+            <w:pPr>
+              <w:jc w:val="center"/>
+            </w:pPr>
+            <w:r>
+              <w:rPr>
+                <w:rFonts w:ascii="Arial" w:cs="Arial" w:eastAsia="Arial" w:hAnsi="Arial"/>
+                <w:b w:val="false"/>
+                <w:bCs w:val="false"/>
+                <w:i w:val="false"/>
+                <w:iCs w:val="false"/>
+                <w:color w:val="000000"/>
+                <w:sz w:val="22"/>
+                <w:szCs w:val="22"/>
+              </w:rPr>
+              <w:t xml:space="preserve">Aprovado</w:t>
+            </w:r>
+          </w:p>
+        </w:tc>
+      </w:tr>
+    </w:tbl>
+    <w:p>
+      <w:pPr>
+        <w:spacing w:after="120" w:before="160"/>
+        <w:jc w:val="left"/>
+      </w:pPr>
+      <w:r>
+        <w:rPr>
+          <w:rFonts w:ascii="Arial" w:cs="Arial" w:eastAsia="Arial" w:hAnsi="Arial"/>
+          <w:b w:val="false"/>
+          <w:bCs w:val="false"/>
+          <w:i w:val="false"/>
+          <w:iCs w:val="false"/>
+          <w:color w:val="000000"/>
+          <w:sz w:val="24"/>
+          <w:szCs w:val="24"/>
+        </w:rPr>
+        <w:t xml:space="preserve">O pior momento registrado ocorreu em 10/05/2024 as 23:00 UTC, com Kp = 9.0, Dst = −308 nT e F10.7 = 188 sfu, resultando em score de 0.9260 (nivel ALTO). O periodo calmo de janeiro de 2024 manteve 98.4% das horas no nivel BAIXO, com score maximo de 0.3168, atingido em um episodio isolado de Kp = 4.0.</w:t>
+      </w:r>
+    </w:p>
+    <w:p>
+      <w:pPr>
+        <w:pStyle w:val="Heading2"/>
+        <w:spacing w:after="80" w:before="0"/>
+        <w:jc w:val="left"/>
+      </w:pPr>
+      <w:r>
+        <w:rPr>
+          <w:rFonts w:ascii="Arial" w:cs="Arial" w:eastAsia="Arial" w:hAnsi="Arial"/>
+          <w:b w:val="false"/>
+          <w:bCs w:val="false"/>
+          <w:i w:val="false"/>
+          <w:iCs w:val="false"/>
+          <w:color w:val="000000"/>
+          <w:sz w:val="24"/>
+          <w:szCs w:val="24"/>
+        </w:rPr>
+        <w:t xml:space="preserve">5.4 Analise e Limitacoes da Validacao</w:t>
+      </w:r>
+    </w:p>
+    <w:p>
+      <w:pPr>
+        <w:spacing w:after="120" w:before="0"/>
+        <w:jc w:val="left"/>
+      </w:pPr>
+      <w:r>
+        <w:rPr>
+          <w:rFonts w:ascii="Arial" w:cs="Arial" w:eastAsia="Arial" w:hAnsi="Arial"/>
+          <w:b w:val="false"/>
+          <w:bCs w:val="false"/>
+          <w:i w:val="false"/>
+          <w:iCs w:val="false"/>
+          <w:color w:val="000000"/>
+          <w:sz w:val="24"/>
+          <w:szCs w:val="24"/>
+        </w:rPr>
+        <w:t xml:space="preserve">O motor de risco demonstrou comportamento consistente com os eventos historicos analisados. A tempestade de maio de 2024, a mais intensa em duas decadas, foi corretamente identificada com alto grau de severidade (score 0.9260). A tempestade de marco de 2023, de intensidade moderada-alta, foi detectada com score maximo de 0.7535, refletindo o menor valor negativo do indice Dst em relacao ao evento de maio.</w:t>
+      </w:r>
+    </w:p>
+    <w:p>
+      <w:pPr>
+        <w:spacing w:after="120" w:before="0"/>
+        <w:jc w:val="left"/>
+      </w:pPr>
+      <w:r>
+        <w:rPr>
+          <w:rFonts w:ascii="Arial" w:cs="Arial" w:eastAsia="Arial" w:hAnsi="Arial"/>
+          <w:b w:val="false"/>
+          <w:bCs w:val="false"/>
+          <w:i w:val="false"/>
+          <w:iCs w:val="false"/>
+          <w:color w:val="000000"/>
+          <w:sz w:val="24"/>
+          <w:szCs w:val="24"/>
+        </w:rPr>
+        <w:t xml:space="preserve">Observa-se que o score composto nao atinge o valor maximo de 1.0 mesmo durante condicoes extremas (Kp = 9, Dst = −406 nT). Isso e consequencia da normalizacao dos pesos e da contribuicao limitada do F10.7 ao score final — comportamento esperado e matematicamente coerente com o modelo adotado.</w:t>
+      </w:r>
+    </w:p>
+    <w:p>
+      <w:pPr>
+        <w:spacing w:after="120" w:before="0"/>
+        <w:jc w:val="left"/>
+      </w:pPr>
+      <w:r>
+        <w:rPr>
+          <w:rFonts w:ascii="Arial" w:cs="Arial" w:eastAsia="Arial" w:hAnsi="Arial"/>
+          <w:b w:val="false"/>
+          <w:bCs w:val="false"/>
+          <w:i w:val="false"/>
+          <w:iCs w:val="false"/>
+          <w:color w:val="000000"/>
+          <w:sz w:val="24"/>
+          <w:szCs w:val="24"/>
+        </w:rPr>
+        <w:t xml:space="preserve">Uma limitacao identificada e a ausencia de modelagem do efeito de persistencia ionosferica: apos o declinio do indice Kp, a ionosfera permanece perturbada por horas, enquanto o motor reduz o score instantaneamente. Esse efeito sera considerado em versoes futuras do sistema.</w:t>
+      </w:r>
+    </w:p>
+    <w:p>
+      <w:pPr>
+        <w:spacing w:after="120" w:before="0"/>
+        <w:jc w:val="left"/>
+      </w:pPr>
+      <w:r>
+        <w:rPr>
+          <w:rFonts w:ascii="Arial" w:cs="Arial" w:eastAsia="Arial" w:hAnsi="Arial"/>
+          <w:b w:val="false"/>
+          <w:bCs w:val="false"/>
+          <w:i w:val="false"/>
+          <w:iCs w:val="false"/>
+          <w:color w:val="000000"/>
+          <w:sz w:val="24"/>
+          <w:szCs w:val="24"/>
+        </w:rPr>
+        <w:t xml:space="preserve">Por fim, a validacao nao inclui dados de cintilacao ionosferica (S4 e sigma_phi) do EMBRACE, pois esses dados historicos nao estao disponiveis publicamente no mesmo formato do sistema em producao. A inclusao desses indices tende a elevar o score durante periodos de alta atividade solar, especialmente na regiao equatorial brasileira, onde a cintilacao e mais intensa.</w:t>
+      </w:r>
+    </w:p>
+    <w:p>
+      <w:pPr>
+        <w:pStyle w:val="Heading1"/>
+        <w:spacing w:after="80" w:before="0"/>
+        <w:jc w:val="left"/>
+      </w:pPr>
+      <w:r>
+        <w:rPr>
+          <w:rFonts w:ascii="Arial" w:cs="Arial" w:eastAsia="Arial" w:hAnsi="Arial"/>
+          <w:b w:val="false"/>
+          <w:bCs w:val="false"/>
+          <w:i w:val="false"/>
+          <w:iCs w:val="false"/>
+          <w:color w:val="000000"/>
+          <w:sz w:val="24"/>
+          <w:szCs w:val="24"/>
+        </w:rPr>
+        <w:t xml:space="preserve">6. API REST</w:t>
       </w:r>
     </w:p>
     <w:p>
@@ -6257,7 +7779,7 @@
           <w:sz w:val="24"/>
           <w:szCs w:val="24"/>
         </w:rPr>
-        <w:t xml:space="preserve">6. Frontend e Interface</w:t>
+        <w:t xml:space="preserve">7. Frontend e Interface</w:t>
       </w:r>
     </w:p>
     <w:p>
@@ -6558,7 +8080,7 @@
           <w:sz w:val="24"/>
           <w:szCs w:val="24"/>
         </w:rPr>
-        <w:t xml:space="preserve">7. Limitacoes e Trabalhos Futuros</w:t>
+        <w:t xml:space="preserve">8. Limitacoes e Trabalhos Futuros</w:t>
       </w:r>
     </w:p>
     <w:p>
@@ -6578,7 +8100,7 @@
           <w:sz w:val="24"/>
           <w:szCs w:val="24"/>
         </w:rPr>
-        <w:t xml:space="preserve">7.1 Limitacoes Atuais</w:t>
+        <w:t xml:space="preserve">8.1 Limitacoes Atuais</w:t>
       </w:r>
     </w:p>
     <w:p>
@@ -6814,7 +8336,7 @@
           <w:sz w:val="24"/>
           <w:szCs w:val="24"/>
         </w:rPr>
-        <w:t xml:space="preserve">8. Referencias</w:t>
+        <w:t xml:space="preserve">9. Referencias</w:t>
       </w:r>
     </w:p>
     <w:p>

</xml_diff>

<commit_message>
docs: restaura acentuacao do portugues no relatorio tecnico
Todo o documento (capa, sumario, secoes, tabelas, rodape) estava sem
acentos e cedilhas. Corrigido com dicionario de ~180 palavras + analise
contextual caso a caso para e/é, esta/está, publica/pública e crase.
URLs, rotas e identificadores de codigo preservados sem alteracao.

Co-Authored-By: Claude Fable 5 <noreply@anthropic.com>
</commit_message>
<xml_diff>
--- a/relatorio_tecnico_clima_solar.docx
+++ b/relatorio_tecnico_clima_solar.docx
@@ -71,7 +71,7 @@
           <w:sz w:val="36"/>
           <w:szCs w:val="36"/>
         </w:rPr>
-        <w:t>Documentacao Tecnica</w:t>
+        <w:t>Documentação Técnica</w:t>
       </w:r>
     </w:p>
     <w:p>
@@ -84,7 +84,7 @@
           <w:sz w:val="28"/>
           <w:szCs w:val="28"/>
         </w:rPr>
-        <w:t>Sistema de Monitoramento de Clima Espacial para Operacoes GNSS</w:t>
+        <w:t>Sistema de Monitoramento de Clima Espacial para Operações GNSS</w:t>
       </w:r>
     </w:p>
     <w:p>
@@ -107,7 +107,7 @@
           <w:sz w:val="22"/>
           <w:szCs w:val="22"/>
         </w:rPr>
-        <w:t>Versao 1.1  |  11 de junho de 2026</w:t>
+        <w:t>Versão 1.1  |  11 de junho de 2026</w:t>
       </w:r>
     </w:p>
     <w:p>
@@ -152,7 +152,7 @@
           <w:sz w:val="20"/>
           <w:szCs w:val="20"/>
         </w:rPr>
-        <w:t>Repositorio: https://github.com/ThomasAK47/clima-solar</w:t>
+        <w:t>Repositório: https://github.com/ThomasAK47/clima-solar</w:t>
       </w:r>
     </w:p>
     <w:p>
@@ -179,7 +179,7 @@
           <w:szCs w:val="24"/>
         </w:rPr>
         <w:lastRenderedPageBreak/>
-        <w:t>Sumario</w:t>
+        <w:t>Sumário</w:t>
       </w:r>
       <w:bookmarkEnd w:id="0"/>
     </w:p>
@@ -211,7 +211,7 @@
                 <w:rStyle w:val="Hyperlink"/>
                 <w:noProof/>
               </w:rPr>
-              <w:t>Sumario</w:t>
+              <w:t>Sumário</w:t>
             </w:r>
             <w:r>
               <w:rPr>
@@ -243,7 +243,7 @@
                 <w:rStyle w:val="Hyperlink"/>
                 <w:noProof/>
               </w:rPr>
-              <w:t>1. Visao Geral do Sistema</w:t>
+              <w:t>1. Visão Geral do Sistema</w:t>
             </w:r>
             <w:r>
               <w:rPr>
@@ -403,7 +403,7 @@
                 <w:rStyle w:val="Hyperlink"/>
                 <w:noProof/>
               </w:rPr>
-              <w:t>2.1 NOAA SWPC — Indice Kp</w:t>
+              <w:t>2.1 NOAA SWPC — Índice Kp</w:t>
             </w:r>
             <w:r>
               <w:rPr>
@@ -467,7 +467,7 @@
                 <w:rStyle w:val="Hyperlink"/>
                 <w:noProof/>
               </w:rPr>
-              <w:t>2.3 Kyoto WDC / NOAA — Indice Dst</w:t>
+              <w:t>2.3 Kyoto WDC / NOAA — Índice Dst</w:t>
             </w:r>
             <w:r>
               <w:rPr>
@@ -531,7 +531,7 @@
                 <w:rStyle w:val="Hyperlink"/>
                 <w:noProof/>
               </w:rPr>
-              <w:t>3. Parametros Monitorados</w:t>
+              <w:t>3. Parâmetros Monitorados</w:t>
             </w:r>
             <w:r>
               <w:rPr>
@@ -563,7 +563,7 @@
                 <w:rStyle w:val="Hyperlink"/>
                 <w:noProof/>
               </w:rPr>
-              <w:t>4. Motor de Risco — Calculo do Score Composto</w:t>
+              <w:t>4. Motor de Risco — Cálculo do Score Composto</w:t>
             </w:r>
             <w:r>
               <w:rPr>
@@ -595,7 +595,7 @@
                 <w:rStyle w:val="Hyperlink"/>
                 <w:noProof/>
               </w:rPr>
-              <w:t>4.1 Normalizacao por Parametro</w:t>
+              <w:t>4.1 Normalização por Parâmetro</w:t>
             </w:r>
             <w:r>
               <w:rPr>
@@ -659,7 +659,7 @@
                 <w:rStyle w:val="Hyperlink"/>
                 <w:noProof/>
               </w:rPr>
-              <w:t>4.3 Comportamento com Fontes Indisponiveis</w:t>
+              <w:t>4.3 Comportamento com Fontes Indisponíveis</w:t>
             </w:r>
             <w:r>
               <w:rPr>
@@ -691,7 +691,7 @@
                 <w:rStyle w:val="Hyperlink"/>
                 <w:noProof/>
               </w:rPr>
-              <w:t>4.4 Classificacao de Risco</w:t>
+              <w:t>4.4 Classificação de Risco</w:t>
             </w:r>
             <w:r>
               <w:rPr>
@@ -723,7 +723,7 @@
                 <w:rStyle w:val="Hyperlink"/>
                 <w:noProof/>
               </w:rPr>
-              <w:t>5. Validacao do Motor de Risco — Backtesting Historico</w:t>
+              <w:t>5. Validação do Motor de Risco — Backtesting Histórico</w:t>
             </w:r>
             <w:r>
               <w:rPr>
@@ -851,7 +851,7 @@
                 <w:rStyle w:val="Hyperlink"/>
                 <w:noProof/>
               </w:rPr>
-              <w:t>5.4 Analise e Limitacoes da Validacao</w:t>
+              <w:t>5.4 Análise e Limitações da Validação</w:t>
             </w:r>
             <w:r>
               <w:rPr>
@@ -1043,7 +1043,7 @@
                 <w:rStyle w:val="Hyperlink"/>
                 <w:noProof/>
               </w:rPr>
-              <w:t>8. Limitacoes e Trabalhos Futuros</w:t>
+              <w:t>8. Limitações e Trabalhos Futuros</w:t>
             </w:r>
             <w:r>
               <w:rPr>
@@ -1075,7 +1075,7 @@
                 <w:rStyle w:val="Hyperlink"/>
                 <w:noProof/>
               </w:rPr>
-              <w:t>8.1 Limitacoes Atuais</w:t>
+              <w:t>8.1 Limitações Atuais</w:t>
             </w:r>
             <w:r>
               <w:rPr>
@@ -1139,7 +1139,7 @@
                 <w:rStyle w:val="Hyperlink"/>
                 <w:noProof/>
               </w:rPr>
-              <w:t>9. Referencias</w:t>
+              <w:t>9. Referências</w:t>
             </w:r>
             <w:r>
               <w:rPr>
@@ -1188,7 +1188,7 @@
           <w:szCs w:val="24"/>
         </w:rPr>
         <w:lastRenderedPageBreak/>
-        <w:t>1. Visao Geral do Sistema</w:t>
+        <w:t>1. Visão Geral do Sistema</w:t>
       </w:r>
       <w:bookmarkEnd w:id="1"/>
     </w:p>
@@ -1217,7 +1217,7 @@
         <w:jc w:val="both"/>
       </w:pPr>
       <w:r>
-        <w:t>O Clima Solar e um aplicativo de monitoramento de clima espacial por geolocalizacao. Dado um par de coordenadas (latitude/longitude), o sistema consulta indices ionosfericos e geomagneticos em tempo real e retorna um score de risco composto (0-1) classificado em tres niveis: BAIXO (verde), MEDIO (amarelo) e ALTO (vermelho). O publico-alvo sao operadores de sistemas GNSS (GPS, GLONASS, Galileo, BeiDou) que precisam de alertas antecipados sobre condicoes adversas de propagacao de sinal.</w:t>
+        <w:t>O Clima Solar é um aplicativo de monitoramento de clima espacial por geolocalização. Dado um par de coordenadas (latitude/longitude), o sistema consulta índices ionosféricos e geomagnéticos em tempo real e retorna um score de risco composto (0-1) classificado em três níveis: BAIXO (verde), MÉDIO (amarelo) e ALTO (vermelho). O público-alvo são operadores de sistemas GNSS (GPS, GLONASS, Galileo, BeiDou) que precisam de alertas antecipados sobre condições adversas de propagação de sinal.</w:t>
       </w:r>
     </w:p>
     <w:p>
@@ -1245,7 +1245,7 @@
         <w:jc w:val="both"/>
       </w:pPr>
       <w:r>
-        <w:t>O sistema e composto por tres camadas principais:</w:t>
+        <w:t>O sistema é composto por três camadas principais:</w:t>
       </w:r>
     </w:p>
     <w:p>
@@ -1259,7 +1259,7 @@
         <w:jc w:val="both"/>
       </w:pPr>
       <w:r>
-        <w:t>Frontend (PWA): Interface HTML/CSS/JavaScript pura, sem frameworks, hospedada no GitHub Pages. Consome a API REST do backend via fetch() e armazena historico local em localStorage.</w:t>
+        <w:t>Frontend (PWA): Interface HTML/CSS/JavaScript pura, sem frameworks, hospedada no GitHub Pages. Consome a API REST do backend via fetch() e armazena histórico local em localStorage.</w:t>
       </w:r>
     </w:p>
     <w:p>
@@ -1273,7 +1273,7 @@
         <w:jc w:val="both"/>
       </w:pPr>
       <w:r>
-        <w:t>Backend (API REST): Servidor FastAPI (Python 3.12) hospedado na plataforma Railway. Executa um loop de atualizacao a cada 15 minutos buscando indices de fontes externas e disponibiliza endpoints REST com cache em memoria.</w:t>
+        <w:t>Backend (API REST): Servidor FastAPI (Python 3.12) hospedado na plataforma Railway. Executa um loop de atualização a cada 15 minutos buscando índices de fontes externas e disponibiliza endpoints REST com cache em memória.</w:t>
       </w:r>
     </w:p>
     <w:p>
@@ -1287,7 +1287,7 @@
         <w:jc w:val="both"/>
       </w:pPr>
       <w:r>
-        <w:t>Fontes de Dados: NOAA SWPC (Kp, F10.7), Kyoto WDC via espelho NOAA (Dst) e EMBRACE/INPE (S4, sigma_phi, VTEC via mapas AMAP e ROTI calculado dos dados GTEX). Os dados sao buscados automaticamente pelo backend; o frontend nunca acessa as fontes diretamente.</w:t>
+        <w:t>Fontes de Dados: NOAA SWPC (Kp, F10.7), Kyoto WDC via espelho NOAA (Dst) e EMBRACE/INPE (S4, sigma_phi, VTEC via mapas AMAP e ROTI calculado dos dados GTEX). Os dados são buscados automaticamente pelo backend; o frontend nunca acessa as fontes diretamente.</w:t>
       </w:r>
     </w:p>
     <w:p>
@@ -1664,7 +1664,7 @@
                 <w:sz w:val="22"/>
                 <w:szCs w:val="22"/>
               </w:rPr>
-              <w:t>Repositorio</w:t>
+              <w:t>Repositório</w:t>
             </w:r>
           </w:p>
         </w:tc>
@@ -1740,7 +1740,7 @@
         <w:jc w:val="both"/>
       </w:pPr>
       <w:r>
-        <w:t>O backend realiza requisicoes HTTP a fontes publicas a cada 15 minutos (Kp, Dst, F10.7, S4/sigma_phi e VTEC) e a cada 6 horas (ROTI, produto diario). Todas as fontes sao de acesso publico e nao requerem autenticacao.</w:t>
+        <w:t>O backend realiza requisições HTTP a fontes públicas a cada 15 minutos (Kp, Dst, F10.7, S4/sigma_phi e VTEC) e a cada 6 horas (ROTI, produto diário). Todas as fontes são de acesso público e não requerem autenticação.</w:t>
       </w:r>
     </w:p>
     <w:p>
@@ -1762,7 +1762,7 @@
           <w:szCs w:val="24"/>
           <w:lang w:val="en-US"/>
         </w:rPr>
-        <w:t>2.1 NOAA SWPC — Indice Kp</w:t>
+        <w:t>2.1 NOAA SWPC — Índice Kp</w:t>
       </w:r>
       <w:bookmarkEnd w:id="6"/>
     </w:p>
@@ -1778,7 +1778,7 @@
         <w:rPr>
           <w:lang w:val="en-US"/>
         </w:rPr>
-        <w:t>Nome e Instituicao: NOAA Space Weather Prediction Center (Boulder, CO, EUA).</w:t>
+        <w:t>Nome e Instituição: NOAA Space Weather Prediction Center (Boulder, CO, EUA).</w:t>
       </w:r>
     </w:p>
     <w:p>
@@ -1812,7 +1812,7 @@
         <w:jc w:val="both"/>
       </w:pPr>
       <w:r>
-        <w:t>Parametro coletado: Indice Kp planetario (campo "Kp" com K maiusculo), frequencia de 15 minutos.</w:t>
+        <w:t>Parâmetro coletado: Índice Kp planetário (campo "Kp" com K maiúsculo), frequência de 15 minutos.</w:t>
       </w:r>
     </w:p>
     <w:p>
@@ -1826,7 +1826,7 @@
         <w:jc w:val="both"/>
       </w:pPr>
       <w:r>
-        <w:t>Metodo de autenticacao: nenhum (endpoint publico REST/JSON).</w:t>
+        <w:t>Método de autenticação: nenhum (endpoint público REST/JSON).</w:t>
       </w:r>
     </w:p>
     <w:p>
@@ -1840,7 +1840,7 @@
         <w:jc w:val="both"/>
       </w:pPr>
       <w:r>
-        <w:t>Formato de resposta: lista de objetos JSON com campos time_tag e Kp. O coletor suporta tanto o formato lista-de-dicts quanto lista-de-listas para garantir compatibilidade com variacoes do endpoint.</w:t>
+        <w:t>Formato de resposta: lista de objetos JSON com campos time_tag e Kp. O coletor suporta tanto o formato lista-de-dicts quanto lista-de-listas para garantir compatibilidade com variações do endpoint.</w:t>
       </w:r>
     </w:p>
     <w:p>
@@ -1854,7 +1854,7 @@
         <w:jc w:val="both"/>
       </w:pPr>
       <w:r>
-        <w:t>Tratamento de falhas: em caso de erro HTTP ou ausencia de valores validos (campo Kp nulo), o ciclo de coleta registra o erro em snapshot.errors e mantem o ultimo valor disponivel em cache ate o proximo ciclo bem-sucedido.</w:t>
+        <w:t>Tratamento de falhas: em caso de erro HTTP ou ausência de valores válidos (campo Kp nulo), o ciclo de coleta registra o erro em snapshot.errors e mantém o último valor disponível em cache até o próximo ciclo bem-sucedido.</w:t>
       </w:r>
     </w:p>
     <w:p>
@@ -1893,7 +1893,7 @@
         <w:rPr>
           <w:lang w:val="en-US"/>
         </w:rPr>
-        <w:t>Nome e Instituicao: NOAA Space Weather Prediction Center.</w:t>
+        <w:t>Nome e Instituição: NOAA Space Weather Prediction Center.</w:t>
       </w:r>
     </w:p>
     <w:p>
@@ -1927,7 +1927,7 @@
         <w:jc w:val="both"/>
       </w:pPr>
       <w:r>
-        <w:t>Parametro coletado: Fluxo de radio solar em 10,7 cm (campo "flux" ou "Flux"), medido em unidades de fluxo solar (sfu).</w:t>
+        <w:t>Parâmetro coletado: Fluxo de rádio solar em 10,7 cm (campo "flux" ou "Flux"), medido em unidades de fluxo solar (sfu).</w:t>
       </w:r>
     </w:p>
     <w:p>
@@ -1941,7 +1941,7 @@
         <w:jc w:val="both"/>
       </w:pPr>
       <w:r>
-        <w:t>Metodo de autenticacao: nenhum. Timeout de 15 segundos.</w:t>
+        <w:t>Método de autenticação: nenhum. Timeout de 15 segundos.</w:t>
       </w:r>
     </w:p>
     <w:p>
@@ -1955,7 +1955,7 @@
         <w:jc w:val="both"/>
       </w:pPr>
       <w:r>
-        <w:t>Formato de resposta: dicionario JSON ou lista de dicts/listas. O coletor identifica automaticamente o formato pelo tipo do dado retornado e extrai o campo de fluxo pelo nome ou posicao.</w:t>
+        <w:t>Formato de resposta: dicionário JSON ou lista de dicts/listas. O coletor identifica automaticamente o formato pelo tipo do dado retornado e extrai o campo de fluxo pelo nome ou posição.</w:t>
       </w:r>
     </w:p>
     <w:p>
@@ -1969,7 +1969,7 @@
         <w:jc w:val="both"/>
       </w:pPr>
       <w:r>
-        <w:t>Tratamento de falhas: idem ao Kp — excecao capturada, erro registrado, ciclo continua com os demais parametros.</w:t>
+        <w:t>Tratamento de falhas: idem ao Kp — exceção capturada, erro registrado, ciclo continua com os demais parâmetros.</w:t>
       </w:r>
     </w:p>
     <w:p>
@@ -1992,7 +1992,7 @@
           <w:sz w:val="24"/>
           <w:szCs w:val="24"/>
         </w:rPr>
-        <w:t>2.3 Kyoto WDC / NOAA — Indice Dst</w:t>
+        <w:t>2.3 Kyoto WDC / NOAA — Índice Dst</w:t>
       </w:r>
       <w:bookmarkEnd w:id="8"/>
     </w:p>
@@ -2002,7 +2002,7 @@
         <w:jc w:val="both"/>
       </w:pPr>
       <w:r>
-        <w:t>Nome e Instituicao: Kyoto World Data Center for Geomagnetism (Kyoto, Japao), espelho disponibilizado pela NOAA.</w:t>
+        <w:t>Nome e Instituição: Kyoto World Data Center for Geomagnetism (Kyoto, Japão), espelho disponibilizado pela NOAA.</w:t>
       </w:r>
     </w:p>
     <w:p>
@@ -2036,7 +2036,7 @@
         <w:jc w:val="both"/>
       </w:pPr>
       <w:r>
-        <w:t>Parametro coletado: Indice de perturbacao geomagnetica Dst (campo "dst"), em nanoTesla (nT). Valores negativos indicam tempestades geomagneticas.</w:t>
+        <w:t>Parâmetro coletado: Índice de perturbação geomagnética Dst (campo "dst"), em nanoTesla (nT). Valores negativos indicam tempestades geomagnéticas.</w:t>
       </w:r>
     </w:p>
     <w:p>
@@ -2050,7 +2050,7 @@
         <w:jc w:val="both"/>
       </w:pPr>
       <w:r>
-        <w:t>Metodo de autenticacao: nenhum (espelho publico NOAA). Timeout de 15 segundos.</w:t>
+        <w:t>Método de autenticação: nenhum (espelho público NOAA). Timeout de 15 segundos.</w:t>
       </w:r>
     </w:p>
     <w:p>
@@ -2078,7 +2078,7 @@
         <w:jc w:val="both"/>
       </w:pPr>
       <w:r>
-        <w:t>Tratamento de falhas: excecao capturada por try/except, erro registrado em snapshot.errors. O motor de risco usa fallback de sub-score 0.5 para Dst quando o dado esta indisponivel.</w:t>
+        <w:t>Tratamento de falhas: exceção capturada por try/except, erro registrado em snapshot.errors. O motor de risco usa fallback de sub-score 0.5 para Dst quando o dado está indisponível.</w:t>
       </w:r>
     </w:p>
     <w:p>
@@ -2124,7 +2124,7 @@
       </w:pPr>
       <w:r>
         <w:lastRenderedPageBreak/>
-        <w:t>Nome e Instituicao: EMBRACE (Estudo e Monitoramento Brasileiro do Clima Espacial), programa do INPE (Instituto Nacional de Pesquisas Espaciais, Sao Jose dos Campos, SP).</w:t>
+        <w:t>Nome e Instituição: EMBRACE (Estudo e Monitoramento Brasileiro do Clima Espacial), programa do INPE (Instituto Nacional de Pesquisas Espaciais, São José dos Campos, SP).</w:t>
       </w:r>
     </w:p>
     <w:p>
@@ -2152,7 +2152,7 @@
         <w:jc w:val="both"/>
       </w:pPr>
       <w:r>
-        <w:t>Parametros coletados: S4 (indice de cintilacao de amplitude, adimensional) e sigma_phi (desvio padrao de fase, em radianos). Os produtos ROTI e VTEC nao estao disponiveis neste produto de mapa e sao obtidos de produtos EMBRACE distintos (secoes 2.5 e 2.6).</w:t>
+        <w:t>Parâmetros coletados: S4 (índice de cintilação de amplitude, adimensional) e sigma_phi (desvio padrão de fase, em radianos). Os produtos ROTI e VTEC não estão disponíveis neste produto de mapa e são obtidos de produtos EMBRACE distintos (seções 2.5 e 2.6).</w:t>
       </w:r>
     </w:p>
     <w:p>
@@ -2166,7 +2166,7 @@
         <w:jc w:val="both"/>
       </w:pPr>
       <w:r>
-        <w:t>Estrutura de acesso: listagem Apache de diretorios organizados por parametro / ano / dia-do-ano (DOY). O coletor le o HTML da listagem, extrai os nomes dos arquivos via regex (padroes S4_MAP_*.txt e SIGMAPHI_MAP_*.txt) e seleciona o mais recente por hora/minuto.</w:t>
+        <w:t>Estrutura de acesso: listagem Apache de diretórios organizados por parâmetro / ano / dia-do-ano (DOY). O coletor lê o HTML da listagem, extrai os nomes dos arquivos via regex (padrões S4_MAP_*.txt e SIGMAPHI_MAP_*.txt) e seleciona o mais recente por hora/minuto.</w:t>
       </w:r>
     </w:p>
     <w:p>
@@ -2180,7 +2180,7 @@
         <w:jc w:val="both"/>
       </w:pPr>
       <w:r>
-        <w:t>Formato das matrizes: arquivo ASCII delimitado por ponto-e-virgula (;), 191 colunas (lon -140 a -20 graus) e ~128 linhas (lat -60 a +50 graus). Valores -1 indicam ausencia de dado e sao convertidos para NaN.</w:t>
+        <w:t>Formato das matrizes: arquivo ASCII delimitado por ponto-e-vírgula (;), 191 colunas (lon -140 a -20 graus) e ~128 linhas (lat -60 a +50 graus). Valores -1 indicam ausência de dado e são convertidos para NaN.</w:t>
       </w:r>
     </w:p>
     <w:p>
@@ -2194,7 +2194,7 @@
         <w:jc w:val="both"/>
       </w:pPr>
       <w:r>
-        <w:t>Interpolacao: bilinear sobre a grade lat/lon, calculada em CPU puro (NumPy) sem chamadas de rede. Cada requisicao /status interpola as matrizes ja armazenadas em cache de memoria.</w:t>
+        <w:t>Interpolação: bilinear sobre a grade lat/lon, calculada em CPU puro (NumPy) sem chamadas de rede. Cada requisição /status interpola as matrizes já armazenadas em cache de memória.</w:t>
       </w:r>
     </w:p>
     <w:p>
@@ -2208,7 +2208,7 @@
         <w:jc w:val="both"/>
       </w:pPr>
       <w:r>
-        <w:t>Defasagem de processamento: ~6 a 9 horas (normal para o produto EMBRACE). Nao ha atraso artificial — e o tempo de processamento do proprio instituto.</w:t>
+        <w:t>Defasagem de processamento: ~6 a 9 horas (normal para o produto EMBRACE). Não há atraso artificial — é o tempo de processamento do próprio instituto.</w:t>
       </w:r>
     </w:p>
     <w:p>
@@ -2222,7 +2222,7 @@
         <w:jc w:val="both"/>
       </w:pPr>
       <w:r>
-        <w:t>Metodo de autenticacao: nenhum (servidor publico Apache). Timeout de 20 segundos por requisicao.</w:t>
+        <w:t>Método de autenticação: nenhum (servidor público Apache). Timeout de 20 segundos por requisição.</w:t>
       </w:r>
     </w:p>
     <w:p>
@@ -2236,7 +2236,7 @@
         <w:jc w:val="both"/>
       </w:pPr>
       <w:r>
-        <w:t>Tratamento de falhas: se o diretorio do dia atual nao tiver arquivos, o coletor tenta o dia anterior. Se ambos falharem, as matrizes ficam como None e o motor de risco redistribui os pesos de S4 e sigma_phi para os demais parametros disponiveis.</w:t>
+        <w:t>Tratamento de falhas: se o diretório do dia atual não tiver arquivos, o coletor tenta o dia anterior. Se ambos falharem, as matrizes ficam como None e o motor de risco redistribui os pesos de S4 e sigma_phi para os demais parâmetros disponíveis.</w:t>
       </w:r>
     </w:p>
     <w:p>
@@ -2267,7 +2267,7 @@
         <w:jc w:val="both"/>
       </w:pPr>
       <w:r>
-        <w:t>Nome e Instituicao: EMBRACE/INPE — mapas de Conteudo Eletronico Total (TECMAP/AMAP), derivados da rede GNSS sul-americana (RBMC, RAMSAC e parceiras). Implementado em backend/app/collectors/embrace_tec.py.</w:t>
+        <w:t>Nome e Instituição: EMBRACE/INPE — mapas de Conteúdo Eletrônico Total (TECMAP/AMAP), derivados da rede GNSS sul-americana (RBMC, RAMSAC e parceiras). Implementado em backend/app/collectors/embrace_tec.py.</w:t>
       </w:r>
     </w:p>
     <w:p>
@@ -2295,7 +2295,7 @@
         <w:jc w:val="both"/>
       </w:pPr>
       <w:r>
-        <w:t>Parametro coletado: VTEC (Vertical Total Electron Content), em TECU (10^16 eletrons/m2).</w:t>
+        <w:t>Parâmetro coletado: VTEC (Vertical Total Electron Content), em TECU (10^16 elétrons/m2).</w:t>
       </w:r>
     </w:p>
     <w:p>
@@ -2309,7 +2309,7 @@
         <w:jc w:val="both"/>
       </w:pPr>
       <w:r>
-        <w:t>Formato das matrizes: mesmo formato ASCII dos mapas de cintilacao — delimitado por ponto-e-virgula (;), com -1 indicando ausencia de dado. Grade de 160 linhas x 120 colunas, latitude -60 a +20 graus e longitude -90 a -30 graus, resolucao de 0,5 grau. A orientacao da grade (linha 0 = latitude -60, ascendente) foi verificada empiricamente pela posicao do pico diurno de TEC.</w:t>
+        <w:t>Formato das matrizes: mesmo formato ASCII dos mapas de cintilação — delimitado por ponto-e-vírgula (;), com -1 indicando ausência de dado. Grade de 160 linhas x 120 colunas, latitude -60 a +20 graus e longitude -90 a -30 graus, resolução de 0,5 grau. A orientação da grade (linha 0 = latitude -60, ascendente) foi verificada empiricamente pela posição do pico diurno de TEC.</w:t>
       </w:r>
     </w:p>
     <w:p>
@@ -2323,7 +2323,7 @@
         <w:jc w:val="both"/>
       </w:pPr>
       <w:r>
-        <w:t>Selecao temporal (correspondencia de horario do dia): como o EMBRACE publica os arquivos AMAP diariamente com defasagem de ~1,5 a 2 dias, o coletor seleciona, do dia mais recente disponivel, o mapa cujo horario UT e o mais proximo do horario atual. Como a ionosfera possui forte ciclo diurno, o valor do mesmo horario do dia anterior e um estimador razoavel da condicao presente em condicoes geomagneticas estaveis. A idade real do mapa e sempre reportada no campo data_age.vtec_map_min da API.</w:t>
+        <w:t>Seleção temporal (correspondência de horário do dia): como o EMBRACE publica os arquivos AMAP diariamente com defasagem de ~1,5 a 2 dias, o coletor seleciona, do dia mais recente disponível, o mapa cujo horário UT é o mais próximo do horário atual. Como a ionosfera possui forte ciclo diurno, o valor do mesmo horário do dia anterior é um estimador razoável da condição presente em condições geomagnéticas estáveis. A idade real do mapa é sempre reportada no campo data_age.vtec_map_min da API.</w:t>
       </w:r>
     </w:p>
     <w:p>
@@ -2337,7 +2337,7 @@
         <w:jc w:val="both"/>
       </w:pPr>
       <w:r>
-        <w:t>Interpolacao: bilinear sobre a grade, identica a utilizada para S4/sigma_phi.</w:t>
+        <w:t>Interpolação: bilinear sobre a grade, idêntica a utilizada para S4/sigma_phi.</w:t>
       </w:r>
     </w:p>
     <w:p>
@@ -2351,7 +2351,7 @@
         <w:jc w:val="both"/>
       </w:pPr>
       <w:r>
-        <w:t>Metodo de autenticacao: nenhum (servidor publico Apache). Timeout de 30 segundos. Tratamento de falhas: busca regressiva de ate 4 dias; se nenhum arquivo for encontrado, VTEC fica como None e seu peso e redistribuido.</w:t>
+        <w:t>Método de autenticação: nenhum (servidor público Apache). Timeout de 30 segundos. Tratamento de falhas: busca regressiva de até 4 dias; se nenhum arquivo for encontrado, VTEC fica como None e seu peso e redistribuido.</w:t>
       </w:r>
     </w:p>
     <w:p>
@@ -2377,7 +2377,7 @@
         <w:jc w:val="both"/>
       </w:pPr>
       <w:r>
-        <w:t>Nome e Instituicao: EMBRACE/INPE — produto GTEX (TEC inclinado absoluto por satelite, amostragem de 30 segundos, por estacao GNSS). O ROTI nao e publicado pelo EMBRACE: e calculado pelo proprio backend a partir dos dados brutos GTEX.</w:t>
+        <w:t>Nome e Instituição: EMBRACE/INPE — produto GTEX (TEC inclinado absoluto por satélite, amostragem de 30 segundos, por estação GNSS). O ROTI não é publicado pelo EMBRACE: é calculado pelo próprio backend a partir dos dados brutos GTEX.</w:t>
       </w:r>
     </w:p>
     <w:p>
@@ -2391,7 +2391,7 @@
         <w:jc w:val="both"/>
       </w:pPr>
       <w:r>
-        <w:t>URL base: https://embracedata.inpe.br/gtex/{ano}/{dia-do-ano}/ com arquivos {estacao}{DDD}0.{AA}_TEC (~600 KB por estacao/dia, formato RINEX-like com cabecalho contendo as coordenadas da estacao).</w:t>
+        <w:t>URL base: https://embracedata.inpe.br/gtex/{ano}/{dia-do-ano}/ com arquivos {estacao}{DDD}0.{AA}_TEC (~600 KB por estação/dia, formato RINEX-like com cabeçalho contendo as coordenadas da estação).</w:t>
       </w:r>
     </w:p>
     <w:p>
@@ -2405,7 +2405,7 @@
         <w:jc w:val="both"/>
       </w:pPr>
       <w:r>
-        <w:t>Metodologia de calculo do ROTI: para cada satelite com elevacao acima de 30 graus, calcula-se a taxa de variacao do TEC (TECU/min) entre amostras consecutivas de 30 s; o ROTI e o desvio-padrao dessa taxa em janelas de 5 minutos (definicao classica de Pi et al., 1997, com limiares regionais conforme Carmo et al., 2021). O valor da estacao em cada intervalo de 10 minutos e o maximo entre os satelites visiveis (pior caso).</w:t>
+        <w:t>Metodologia de cálculo do ROTI: para cada satélite com elevação acima de 30 graus, calcula-se a taxa de variação do TEC (TECU/min) entre amostras consecutivas de 30 s; o ROTI é o desvio-padrão dessa taxa em janelas de 5 minutos (definição clássica de Pi et al., 1997, com limiares regionais conforme Carmo et al., 2021). O valor da estação em cada intervalo de 10 minutos é o máximo entre os satélites visiveis (pior caso).</w:t>
       </w:r>
     </w:p>
     <w:p>
@@ -2419,7 +2419,7 @@
         <w:jc w:val="both"/>
       </w:pPr>
       <w:r>
-        <w:t>Estacoes utilizadas: 12 estacoes distribuidas pelo territorio nacional (boav, saga, naus, bele, impz, rnna, pepe, braz, goja, onrj, ufpr, poal), cobrindo do extremo norte (Boa Vista) ao sul (Porto Alegre).</w:t>
+        <w:t>Estações utilizadas: 12 estações distribuídas pelo território nacional (boav, saga, naus, bele, impz, rnna, pepe, braz, goja, onrj, ufpr, poal), cobrindo do extremo norte (Boa Vista) ao sul (Porto Alegre).</w:t>
       </w:r>
     </w:p>
     <w:p>
@@ -2433,7 +2433,7 @@
         <w:jc w:val="both"/>
       </w:pPr>
       <w:r>
-        <w:t>Atribuicao espacial: o valor em (lat, lon) e o da estacao mais proxima num raio de ate 1.200 km (distancia haversine). Fora desse raio, ROTI retorna None.</w:t>
+        <w:t>Atribuição espacial: o valor em (lat, lon) é o da estação mais próxima num raio de até 1.200 km (distância haversine). Fora desse raio, ROTI retorna None.</w:t>
       </w:r>
     </w:p>
     <w:p>
@@ -2447,7 +2447,7 @@
         <w:jc w:val="both"/>
       </w:pPr>
       <w:r>
-        <w:t>Selecao temporal: mesma estrategia de correspondencia de horario do dia usada para o VTEC — usa-se o intervalo de 10 minutos correspondente ao horario UT atual, do dia mais recente disponivel (defasagem de ~1,5 a 2 dias, reportada em data_age.roti_day_min).</w:t>
+        <w:t>Seleção temporal: mesma estratégia de correspondência de horário do dia usada para o VTEC — usa-se o intervalo de 10 minutos correspondente ao horário UT atual, do dia mais recente disponível (defasagem de ~1,5 a 2 dias, reportada em data_age.roti_day_min).</w:t>
       </w:r>
     </w:p>
     <w:p>
@@ -2461,7 +2461,7 @@
         <w:jc w:val="both"/>
       </w:pPr>
       <w:r>
-        <w:t>Frequencia de coleta: como o produto e diario, o download (~7 MB) e o processamento sao refeitos a cada 6 horas, e nao a cada ciclo de 15 minutos. O parsing e executado em thread separada (asyncio.to_thread) para nao bloquear o event loop.</w:t>
+        <w:t>Frequência de coleta: como o produto é diário, o download (~7 MB) e o processamento são refeitos a cada 6 horas, e não a cada ciclo de 15 minutos. O parsing é executado em thread separada (asyncio.to_thread) para não bloquear o event loop.</w:t>
       </w:r>
     </w:p>
     <w:p>
@@ -2475,7 +2475,7 @@
         <w:jc w:val="both"/>
       </w:pPr>
       <w:r>
-        <w:t>Metodo de autenticacao: nenhum (servidor publico Apache). Tratamento de falhas: busca regressiva de ate 4 dias; estacoes com arquivo ausente ou corrompido sao simplesmente ignoradas.</w:t>
+        <w:t>Método de autenticação: nenhum (servidor público Apache). Tratamento de falhas: busca regressiva de até 4 dias; estações com arquivo ausente ou corrompido são simplesmente ignoradas.</w:t>
       </w:r>
     </w:p>
     <w:p>
@@ -2502,7 +2502,7 @@
           <w:szCs w:val="24"/>
         </w:rPr>
         <w:lastRenderedPageBreak/>
-        <w:t>3. Parametros Monitorados</w:t>
+        <w:t>3. Parâmetros Monitorados</w:t>
       </w:r>
       <w:bookmarkEnd w:id="10"/>
     </w:p>
@@ -2512,7 +2512,7 @@
         <w:jc w:val="both"/>
       </w:pPr>
       <w:r>
-        <w:t>A tabela a seguir descreve cada parametro coletado, sua grandeza fisica, unidade de medida, os tres limiares de risco e a fonte de dados correspondente.</w:t>
+        <w:t>A tabela a seguir descreve cada parâmetro coletado, sua grandeza física, unidade de medida, os três limiares de risco e a fonte de dados correspondente.</w:t>
       </w:r>
     </w:p>
     <w:tbl>
@@ -2580,7 +2580,7 @@
                 <w:sz w:val="22"/>
                 <w:szCs w:val="22"/>
               </w:rPr>
-              <w:t>Parametro</w:t>
+              <w:t>Parâmetro</w:t>
             </w:r>
           </w:p>
         </w:tc>
@@ -2613,7 +2613,7 @@
                 <w:sz w:val="22"/>
                 <w:szCs w:val="22"/>
               </w:rPr>
-              <w:t>Descricao fisica</w:t>
+              <w:t>Descrição física</w:t>
             </w:r>
           </w:p>
         </w:tc>
@@ -2712,7 +2712,7 @@
                 <w:sz w:val="22"/>
                 <w:szCs w:val="22"/>
               </w:rPr>
-              <w:t>Medio (amarelo)</w:t>
+              <w:t>Médio (amarelo)</w:t>
             </w:r>
           </w:p>
         </w:tc>
@@ -2848,7 +2848,7 @@
                 <w:sz w:val="22"/>
                 <w:szCs w:val="22"/>
               </w:rPr>
-              <w:t>Indice geomagnetico planetario — mede perturbacoes no campo magnetico terrestre causadas pelo vento solar</w:t>
+              <w:t>Índice geomagnético planetário — mede perturbações no campo magnético terrestre causadas pelo vento solar</w:t>
             </w:r>
           </w:p>
         </w:tc>
@@ -3073,7 +3073,7 @@
                 <w:sz w:val="22"/>
                 <w:szCs w:val="22"/>
               </w:rPr>
-              <w:t>Indice de tempestade geomagnetica — variacao do campo magnetico no equador; valores negativos indicam tempestades</w:t>
+              <w:t>Índice de tempestade geomagnética — variação do campo magnético no equador; valores negativos indicam tempestades</w:t>
             </w:r>
           </w:p>
         </w:tc>
@@ -3298,7 +3298,7 @@
                 <w:sz w:val="22"/>
                 <w:szCs w:val="22"/>
               </w:rPr>
-              <w:t>Fluxo de radio solar em 10,7 cm — proxy da atividade solar e ionizacao ionosferica</w:t>
+              <w:t>Fluxo de rádio solar em 10,7 cm — proxy da atividade solar e ionização ionosférica</w:t>
             </w:r>
           </w:p>
         </w:tc>
@@ -3523,7 +3523,7 @@
                 <w:sz w:val="22"/>
                 <w:szCs w:val="22"/>
               </w:rPr>
-              <w:t>Indice de cintilacao de amplitude — variacao da potencia do sinal GNSS ao atravessar a ionosfera</w:t>
+              <w:t>Índice de cintilação de amplitude — variação da potência do sinal GNSS ao atravessar a ionosfera</w:t>
             </w:r>
           </w:p>
         </w:tc>
@@ -3748,7 +3748,7 @@
                 <w:sz w:val="22"/>
                 <w:szCs w:val="22"/>
               </w:rPr>
-              <w:t xml:space="preserve">Cintilacao de fase — desvio padrao da fase do sinal GNSS em 60 s (Phi60); afeta </w:t>
+              <w:t xml:space="preserve">Cintilação de fase — desvio padrão da fase do sinal GNSS em 60 s (Phi60); afeta </w:t>
               <w:lastRenderedPageBreak/>
               <w:t>diretamente o rastreamento de portadora nos receptores</w:t>
             </w:r>
@@ -3976,7 +3976,7 @@
                 <w:sz w:val="22"/>
                 <w:szCs w:val="22"/>
               </w:rPr>
-              <w:t>Conteudo eletronico total vertical — eletrons livres integrados na coluna ionosferica; principal causa do atraso de propagacao GNSS (~16 cm de erro em L1 por TECU)</w:t>
+              <w:t>Conteúdo eletrônico total vertical — elétrons livres integrados na coluna ionosférica; principal causa do atraso de propagação GNSS (~16 cm de erro em L1 por TECU)</w:t>
             </w:r>
           </w:p>
         </w:tc>
@@ -4201,7 +4201,7 @@
                 <w:sz w:val="22"/>
                 <w:szCs w:val="22"/>
               </w:rPr>
-              <w:t>Rate of TEC Index — desvio-padrao da taxa de variacao do TEC em janelas de 5 min; indicador de irregularidades ionosfericas que degradam RTK/PPP</w:t>
+              <w:t>Rate of TEC Index — desvio-padrão da taxa de variação do TEC em janelas de 5 min; indicador de irregularidades ionosféricas que degradam RTK/PPP</w:t>
             </w:r>
           </w:p>
         </w:tc>
@@ -4380,7 +4380,7 @@
           <w:sz w:val="22"/>
           <w:szCs w:val="22"/>
         </w:rPr>
-        <w:t>Nota: VTEC e ROTI sao baseados em produtos EMBRACE publicados com defasagem de ~1,5 a 2 dias; o sistema utiliza o valor observado no mesmo horario UT do dia mais recente disponivel (correspondencia de horario do dia, secoes 2.5 e 2.6). Os limiares de ROTI seguem a literatura regional (Carmo et al., 2021). Ambos possuem peso de 0,10 no score composto.</w:t>
+        <w:t>Nota: VTEC e ROTI são baseados em produtos EMBRACE publicados com defasagem de ~1,5 a 2 dias; o sistema utiliza o valor observado no mesmo horário UT do dia mais recente disponível (correspondência de horário do dia, seções 2.5 e 2.6). Os limiares de ROTI seguem a literatura regional (Carmo et al., 2021). Ambos possuem peso de 0,10 no score composto.</w:t>
       </w:r>
     </w:p>
     <w:p>
@@ -4412,7 +4412,7 @@
           <w:szCs w:val="24"/>
         </w:rPr>
         <w:lastRenderedPageBreak/>
-        <w:t>4. Motor de Risco — Calculo do Score Composto</w:t>
+        <w:t>4. Motor de Risco — Cálculo do Score Composto</w:t>
       </w:r>
       <w:bookmarkEnd w:id="11"/>
     </w:p>
@@ -4431,7 +4431,7 @@
           <w:sz w:val="24"/>
           <w:szCs w:val="24"/>
         </w:rPr>
-        <w:t>4.1 Normalizacao por Parametro</w:t>
+        <w:t>4.1 Normalização por Parâmetro</w:t>
       </w:r>
       <w:bookmarkEnd w:id="12"/>
     </w:p>
@@ -4441,7 +4441,7 @@
         <w:jc w:val="both"/>
       </w:pPr>
       <w:r>
-        <w:t>Cada parametro bruto e convertido em um sub-score normalizado no intervalo [0, 1] por funcoes de normalizacao lineares por partes. As funcoes seguem um padrao de tres zonas: zona verde (sub-score 0 a 0,3), zona amarela (0,3 a 0,6) e zona vermelha (0,6 a 1,0). A seguir estao as funcoes implementadas em risk_engine.py:</w:t>
+        <w:t>Cada parâmetro bruto é convertido em um sub-score normalizado no intervalo [0, 1] por funções de normalização lineares por partes. As funções seguem um padrão de três zonas: zona verde (sub-score 0 a 0,3), zona amarela (0,3 a 0,6) e zona vermelha (0,6 a 1,0). A seguir estão as funções implementadas em risk_engine.py:</w:t>
       </w:r>
     </w:p>
     <w:p>
@@ -4572,7 +4572,7 @@
         <w:jc w:val="both"/>
       </w:pPr>
       <w:r>
-        <w:t>O score composto e calculado como uma media ponderada dos sub-scores dos parametros disponiveis:</w:t>
+        <w:t>O score composto é calculado como uma média ponderada dos sub-scores dos parâmetros disponíveis:</w:t>
       </w:r>
     </w:p>
     <w:tbl>
@@ -4636,7 +4636,7 @@
                 <w:sz w:val="22"/>
                 <w:szCs w:val="22"/>
               </w:rPr>
-              <w:t>Parametro</w:t>
+              <w:t>Parâmetro</w:t>
             </w:r>
           </w:p>
         </w:tc>
@@ -4702,7 +4702,7 @@
                 <w:sz w:val="22"/>
                 <w:szCs w:val="22"/>
               </w:rPr>
-              <w:t>Descricao</w:t>
+              <w:t>Descrição</w:t>
             </w:r>
           </w:p>
         </w:tc>
@@ -4803,7 +4803,7 @@
                 <w:sz w:val="22"/>
                 <w:szCs w:val="22"/>
               </w:rPr>
-              <w:t>Atividade geomagnetica global</w:t>
+              <w:t>Atividade geomagnética global</w:t>
             </w:r>
           </w:p>
         </w:tc>
@@ -4904,7 +4904,7 @@
                 <w:sz w:val="22"/>
                 <w:szCs w:val="22"/>
               </w:rPr>
-              <w:t>Intensidade de tempestade geomagnetica</w:t>
+              <w:t>Intensidade de tempestade geomagnética</w:t>
             </w:r>
           </w:p>
         </w:tc>
@@ -5005,7 +5005,7 @@
                 <w:sz w:val="22"/>
                 <w:szCs w:val="22"/>
               </w:rPr>
-              <w:t>Atividade solar / ionizacao ionosferica</w:t>
+              <w:t>Atividade solar / ionização ionosférica</w:t>
             </w:r>
           </w:p>
         </w:tc>
@@ -5106,7 +5106,7 @@
                 <w:sz w:val="22"/>
                 <w:szCs w:val="22"/>
               </w:rPr>
-              <w:t>Cintilacao de amplitude GNSS</w:t>
+              <w:t>Cintilação de amplitude GNSS</w:t>
             </w:r>
           </w:p>
         </w:tc>
@@ -5207,7 +5207,7 @@
                 <w:sz w:val="22"/>
                 <w:szCs w:val="22"/>
               </w:rPr>
-              <w:t>Cintilacao de fase GNSS</w:t>
+              <w:t>Cintilação de fase GNSS</w:t>
             </w:r>
           </w:p>
         </w:tc>
@@ -5308,7 +5308,7 @@
                 <w:sz w:val="22"/>
                 <w:szCs w:val="22"/>
               </w:rPr>
-              <w:t>Taxa de variacao de TEC (calculado do GTEX)</w:t>
+              <w:t>Taxa de variação de TEC (calculado do GTEX)</w:t>
             </w:r>
           </w:p>
         </w:tc>
@@ -5409,7 +5409,7 @@
                 <w:sz w:val="22"/>
                 <w:szCs w:val="22"/>
               </w:rPr>
-              <w:t>Conteudo eletronico total vertical (mapas AMAP)</w:t>
+              <w:t>Conteúdo eletrônico total vertical (mapas AMAP)</w:t>
             </w:r>
           </w:p>
         </w:tc>
@@ -5524,7 +5524,7 @@
           <w:b/>
           <w:bCs/>
         </w:rPr>
-        <w:t>Formula do score final:</w:t>
+        <w:t>Fórmula do score final:</w:t>
       </w:r>
     </w:p>
     <w:p>
@@ -5549,7 +5549,7 @@
         <w:jc w:val="both"/>
       </w:pPr>
       <w:r>
-        <w:t>onde o somatorio considera apenas os parametros com valores disponiveis. Parametros ausentes (null) nao sao incluidos no numerador nem no denominador, garantindo que o score sempre utilize 100% do peso disponivel — nunca 80% ou menos.</w:t>
+        <w:t>onde o somatório considera apenas os parâmetros com valores disponíveis. Parâmetros ausentes (null) não são incluídos no numerador nem no denominador, garantindo que o score sempre utilize 100% do peso disponível — nunca 80% ou menos.</w:t>
       </w:r>
     </w:p>
     <w:p>
@@ -5567,7 +5567,7 @@
           <w:sz w:val="24"/>
           <w:szCs w:val="24"/>
         </w:rPr>
-        <w:t>4.3 Comportamento com Fontes Indisponiveis</w:t>
+        <w:t>4.3 Comportamento com Fontes Indisponíveis</w:t>
       </w:r>
       <w:bookmarkEnd w:id="14"/>
     </w:p>
@@ -5592,7 +5592,7 @@
       </w:pPr>
       <w:r>
         <w:lastRenderedPageBreak/>
-        <w:t>Kp, Dst e F10.7: se indisponiveis, recebem sub-score de fallback igual a 0,5 (risco moderado) e sao incluidos no calculo com seu peso integral. Isso evita que falhas de rede na NOAA mascararem um evento solar.</w:t>
+        <w:t>Kp, Dst e F10.7: se indisponíveis, recebem sub-score de fallback igual a 0,5 (risco moderado) e são incluídos no cálculo com seu peso integral. Isso evita que falhas de rede na NOAA mascararem um evento solar.</w:t>
       </w:r>
     </w:p>
     <w:p>
@@ -5606,7 +5606,7 @@
         <w:jc w:val="both"/>
       </w:pPr>
       <w:r>
-        <w:t>S4, sigma_phi, ROTI e VTEC: se indisponiveis (None), seus pesos sao removidos tanto do numerador quanto do denominador. O score e calculado apenas sobre os parametros presentes, com redistribuicao proporcional automatica dos pesos.</w:t>
+        <w:t>S4, sigma_phi, ROTI e VTEC: se indisponíveis (None), seus pesos são removidos tanto do numerador quanto do denominador. O score é calculado apenas sobre os parâmetros presentes, com redistribuição proporcional automática dos pesos.</w:t>
       </w:r>
     </w:p>
     <w:p>
@@ -5629,7 +5629,7 @@
           <w:sz w:val="24"/>
           <w:szCs w:val="24"/>
         </w:rPr>
-        <w:t>4.4 Classificacao de Risco</w:t>
+        <w:t>4.4 Classificação de Risco</w:t>
       </w:r>
       <w:bookmarkEnd w:id="15"/>
     </w:p>
@@ -5695,7 +5695,7 @@
                 <w:sz w:val="22"/>
                 <w:szCs w:val="22"/>
               </w:rPr>
-              <w:t>Nivel</w:t>
+              <w:t>Nível</w:t>
             </w:r>
           </w:p>
         </w:tc>
@@ -5794,7 +5794,7 @@
                 <w:sz w:val="22"/>
                 <w:szCs w:val="22"/>
               </w:rPr>
-              <w:t>Interpretacao</w:t>
+              <w:t>Interpretação</w:t>
             </w:r>
           </w:p>
         </w:tc>
@@ -5926,7 +5926,7 @@
                 <w:sz w:val="22"/>
                 <w:szCs w:val="22"/>
               </w:rPr>
-              <w:t>Condicoes normais. Operacoes GNSS sem restricoes.</w:t>
+              <w:t>Condições normais. Operações GNSS sem restrições.</w:t>
             </w:r>
           </w:p>
         </w:tc>
@@ -5965,7 +5965,7 @@
                 <w:sz w:val="22"/>
                 <w:szCs w:val="22"/>
               </w:rPr>
-              <w:t>MEDIO</w:t>
+              <w:t>MÉDIO</w:t>
             </w:r>
           </w:p>
         </w:tc>
@@ -6058,7 +6058,7 @@
                 <w:sz w:val="22"/>
                 <w:szCs w:val="22"/>
               </w:rPr>
-              <w:t>Perturbacoes moderadas. Monitoramento recomendado.</w:t>
+              <w:t>Perturbações moderadas. Monitoramento recomendado.</w:t>
             </w:r>
           </w:p>
         </w:tc>
@@ -6190,7 +6190,7 @@
                 <w:sz w:val="22"/>
                 <w:szCs w:val="22"/>
               </w:rPr>
-              <w:t>Condicoes adversas. Degradacao de performance GNSS provavel.</w:t>
+              <w:t>Condições adversas. Degradação de performance GNSS provável.</w:t>
             </w:r>
           </w:p>
         </w:tc>
@@ -6225,7 +6225,7 @@
           <w:szCs w:val="24"/>
         </w:rPr>
         <w:lastRenderedPageBreak/>
-        <w:t>5. Validacao do Motor de Risco — Backtesting Historico</w:t>
+        <w:t>5. Validação do Motor de Risco — Backtesting Histórico</w:t>
       </w:r>
       <w:bookmarkEnd w:id="16"/>
     </w:p>
@@ -6254,7 +6254,7 @@
         <w:jc w:val="both"/>
       </w:pPr>
       <w:r>
-        <w:t>Para validar a calibracao do motor de risco, foi desenvolvido um script de backtesting (backtest_score.py) que coleta dados historicos reais das mesmas fontes utilizadas pelo sistema em producao — Kp via GFZ Potsdam (cobertura desde 1932), Dst via Kyoto World Data Center e F10.7 via NOAA — e executa o motor de risco hora a hora para periodos de interesse. Os dados de cintilacao ionosferica (S4 e sigma_phi) do EMBRACE nao estao disponiveis no historico publico, portanto a validacao considera apenas os tres indices de clima espacial global.</w:t>
+        <w:t>Para validar a calibração do motor de risco, foi desenvolvido um script de backtesting (backtest_score.py) que coleta dados históricos reais das mesmas fontes utilizadas pelo sistema em produção — Kp via GFZ Potsdam (cobertura desde 1932), Dst via Kyoto World Data Center e F10.7 via NOAA — e executa o motor de risco hora a hora para períodos de interesse. Os dados de cintilação ionosférica (S4 e sigma_phi) do EMBRACE não estão disponíveis no histórico público, portanto a validação considera apenas os três índices de clima espacial global.</w:t>
       </w:r>
     </w:p>
     <w:p>
@@ -6370,7 +6370,7 @@
                 <w:sz w:val="22"/>
                 <w:szCs w:val="22"/>
               </w:rPr>
-              <w:t>Periodo</w:t>
+              <w:t>Período</w:t>
             </w:r>
           </w:p>
         </w:tc>
@@ -6440,7 +6440,7 @@
                 <w:sz w:val="22"/>
                 <w:szCs w:val="22"/>
               </w:rPr>
-              <w:t>Tempestade Geomagnetica — Maio 2024</w:t>
+              <w:t>Tempestade Geomagnética — Maio 2024</w:t>
             </w:r>
           </w:p>
         </w:tc>
@@ -6535,7 +6535,7 @@
                 <w:sz w:val="22"/>
                 <w:szCs w:val="22"/>
               </w:rPr>
-              <w:t>Tempestade Geomagnetica — Marco 2023</w:t>
+              <w:t>Tempestade Geomagnética — Março 2023</w:t>
             </w:r>
           </w:p>
         </w:tc>
@@ -6630,7 +6630,7 @@
                 <w:sz w:val="22"/>
                 <w:szCs w:val="22"/>
               </w:rPr>
-              <w:t>Periodo Calmo — Janeiro 2024</w:t>
+              <w:t>Período Calmo — Janeiro 2024</w:t>
             </w:r>
           </w:p>
         </w:tc>
@@ -6876,7 +6876,7 @@
                 <w:sz w:val="22"/>
                 <w:szCs w:val="22"/>
               </w:rPr>
-              <w:t>% MEDIO</w:t>
+              <w:t>% MÉDIO</w:t>
             </w:r>
           </w:p>
         </w:tc>
@@ -7161,7 +7161,7 @@
                 <w:sz w:val="22"/>
                 <w:szCs w:val="22"/>
               </w:rPr>
-              <w:t>Tempestade Marco 2023</w:t>
+              <w:t>Tempestade Março 2023</w:t>
             </w:r>
           </w:p>
         </w:tc>
@@ -7343,7 +7343,7 @@
                 <w:sz w:val="22"/>
                 <w:szCs w:val="22"/>
               </w:rPr>
-              <w:t>Periodo Calmo Jan 2024</w:t>
+              <w:t>Período Calmo Jan 2024</w:t>
             </w:r>
           </w:p>
         </w:tc>
@@ -7500,7 +7500,7 @@
         <w:jc w:val="both"/>
       </w:pPr>
       <w:r>
-        <w:t>O pior momento registrado ocorreu em 10/05/2024 as 23:00 UTC, com Kp = 9.0, Dst = −308 nT e F10.7 = 188 sfu, resultando em score de 0.9260 (nivel ALTO). O periodo calmo de janeiro de 2024 manteve 98.4% das horas no nivel BAIXO, com score maximo de 0.3168, atingido em um episodio isolado de Kp = 4.0.</w:t>
+        <w:t>O pior momento registrado ocorreu em 10/05/2024 às 23:00 UTC, com Kp = 9.0, Dst = −308 nT e F10.7 = 188 sfu, resultando em score de 0.9260 (nível ALTO). O período calmo de janeiro de 2024 manteve 98.4% das horas no nível BAIXO, com score máximo de 0.3168, atingido em um episódio isolado de Kp = 4.0.</w:t>
       </w:r>
     </w:p>
     <w:p>
@@ -7518,7 +7518,7 @@
           <w:sz w:val="24"/>
           <w:szCs w:val="24"/>
         </w:rPr>
-        <w:t>5.4 Analise e Limitacoes da Validacao</w:t>
+        <w:t>5.4 Análise e Limitações da Validação</w:t>
       </w:r>
       <w:bookmarkEnd w:id="20"/>
     </w:p>
@@ -7528,7 +7528,7 @@
         <w:jc w:val="both"/>
       </w:pPr>
       <w:r>
-        <w:t>O motor de risco demonstrou comportamento consistente com os eventos historicos analisados. A tempestade de maio de 2024, a mais intensa em duas decadas, foi corretamente identificada com alto grau de severidade (score 0.9260). A tempestade de marco de 2023, de intensidade moderada-alta, foi detectada com score maximo de 0.7535, refletindo o menor valor negativo do indice Dst em relacao ao evento de maio.</w:t>
+        <w:t>O motor de risco demonstrou comportamento consistente com os eventos históricos analisados. A tempestade de maio de 2024, a mais intensa em duas décadas, foi corretamente identificada com alto grau de severidade (score 0.9260). A tempestade de março de 2023, de intensidade moderada-alta, foi detectada com score máximo de 0.7535, refletindo o menor valor negativo do índice Dst em relação ao evento de maio.</w:t>
       </w:r>
     </w:p>
     <w:p>
@@ -7537,7 +7537,7 @@
         <w:jc w:val="both"/>
       </w:pPr>
       <w:r>
-        <w:t>Observa-se que o score composto nao atinge o valor maximo de 1.0 mesmo durante condicoes extremas (Kp = 9, Dst = −406 nT). Isso e consequencia da normalizacao dos pesos e da contribuicao limitada do F10.7 ao score final — comportamento esperado e matematicamente coerente com o modelo adotado.</w:t>
+        <w:t>Observa-se que o score composto não atinge o valor máximo de 1.0 mesmo durante condições extremas (Kp = 9, Dst = −406 nT). Isso é consequência da normalização dos pesos e da contribuição limitada do F10.7 ao score final — comportamento esperado e matematicamente coerente com o modelo adotado.</w:t>
       </w:r>
     </w:p>
     <w:p>
@@ -7546,9 +7546,9 @@
         <w:jc w:val="both"/>
       </w:pPr>
       <w:r>
-        <w:t xml:space="preserve">Uma limitacao identificada e a ausencia de modelagem do efeito de persistencia ionosferica: apos o declinio do indice Kp, a ionosfera permanece perturbada por </w:t>
+        <w:t xml:space="preserve">Uma limitação identificada é a ausência de modelagem do efeito de persistência ionosférica: após o declínio do índice Kp, a ionosfera permanece perturbada por </w:t>
         <w:lastRenderedPageBreak/>
-        <w:t>horas, enquanto o motor reduz o score instantaneamente. Esse efeito sera considerado em versoes futuras do sistema.</w:t>
+        <w:t>horas, enquanto o motor reduz o score instantaneamente. Esse efeito será considerado em versões futuras do sistema.</w:t>
       </w:r>
     </w:p>
     <w:p>
@@ -7557,7 +7557,7 @@
         <w:jc w:val="both"/>
       </w:pPr>
       <w:r>
-        <w:t>Por fim, a validacao nao inclui dados de cintilacao ionosferica (S4 e sigma_phi) do EMBRACE, pois esses dados historicos nao estao disponiveis publicamente no mesmo formato do sistema em producao. A inclusao desses indices tende a elevar o score durante periodos de alta atividade solar, especialmente na regiao equatorial brasileira, onde a cintilacao e mais intensa.</w:t>
+        <w:t>Por fim, a validação não inclui dados de cintilação ionosférica (S4 e sigma_phi) do EMBRACE, pois esses dados históricos não estão disponíveis publicamente no mesmo formato do sistema em produção. A inclusão desses índices tende a elevar o score durante períodos de alta atividade solar, especialmente na região equatorial brasileira, onde a cintilação é mais intensa.</w:t>
       </w:r>
     </w:p>
     <w:p>
@@ -7592,10 +7592,10 @@
         <w:rPr>
           <w:lang w:val="en-US"/>
         </w:rPr>
-        <w:t xml:space="preserve">O backend expoe quatro endpoints publicos. </w:t>
-      </w:r>
-      <w:r>
-        <w:t>A URL base de producao e https://clima-solar-production.up.railway.app. CORS esta habilitado para todas as origens (allow_origins=["*"]).</w:t>
+        <w:t xml:space="preserve">O backend expõe quatro endpoints públicos. </w:t>
+      </w:r>
+      <w:r>
+        <w:t>A URL base de produção é https://clima-solar-production.up.railway.app. CORS está habilitado para todas as origens (allow_origins=["*"]).</w:t>
       </w:r>
     </w:p>
     <w:tbl>
@@ -7661,7 +7661,7 @@
                 <w:sz w:val="22"/>
                 <w:szCs w:val="22"/>
               </w:rPr>
-              <w:t>Metodo</w:t>
+              <w:t>Método</w:t>
             </w:r>
           </w:p>
         </w:tc>
@@ -7727,7 +7727,7 @@
                 <w:sz w:val="22"/>
                 <w:szCs w:val="22"/>
               </w:rPr>
-              <w:t>Parametros</w:t>
+              <w:t>Parâmetros</w:t>
             </w:r>
           </w:p>
         </w:tc>
@@ -7898,7 +7898,7 @@
                 <w:szCs w:val="22"/>
                 <w:lang w:val="en-US"/>
               </w:rPr>
-              <w:t>lat (float), lon (float) — obrigatorios; -90&lt;=lat&lt;=90, -180&lt;=lon&lt;=180</w:t>
+              <w:t>lat (float), lon (float) — obrigatórios; -90&lt;=lat&lt;=90, -180&lt;=lon&lt;=180</w:t>
             </w:r>
           </w:p>
         </w:tc>
@@ -7929,7 +7929,7 @@
                 <w:sz w:val="22"/>
                 <w:szCs w:val="22"/>
               </w:rPr>
-              <w:t>score composto, nivel de risco, sub-scores por parametro (incluindo roti e vtec), valores brutos (vtec_tecu, roti_tecu_min), idade dos dados (vtec_map_min, roti_day_min), erros de coleta</w:t>
+              <w:t>score composto, nível de risco, sub-scores por parâmetro (incluindo roti e vtec), valores brutos (vtec_tecu, roti_tecu_min), idade dos dados (vtec_map_min, roti_day_min), erros de coleta</w:t>
             </w:r>
           </w:p>
         </w:tc>
@@ -8065,7 +8065,7 @@
                 <w:szCs w:val="22"/>
                 <w:lang w:val="en-US"/>
               </w:rPr>
-              <w:t>lat (float), lon (float) — obrigatorios</w:t>
+              <w:t>lat (float), lon (float) — obrigatórios</w:t>
             </w:r>
           </w:p>
         </w:tc>
@@ -8096,7 +8096,7 @@
                 <w:sz w:val="22"/>
                 <w:szCs w:val="22"/>
               </w:rPr>
-              <w:t>Ultimas 48 horas de leituras para a localizacao (arredondada a 1 decimal de grau), ordenadas da mais antiga para a mais recente</w:t>
+              <w:t>Últimas 48 horas de leituras para a localização (arredondada a 1 decimal de grau), ordenadas da mais antiga para a mais recente</w:t>
             </w:r>
           </w:p>
         </w:tc>
@@ -8259,7 +8259,7 @@
                 <w:sz w:val="22"/>
                 <w:szCs w:val="22"/>
               </w:rPr>
-              <w:t>Grade 0,5 grau cobrindo o Brasil (~7.500 pontos) com {lat, lon, s4, vtec, score} por ponto; o score de cada ponto pondera tambem VTEC e ROTI quando disponiveis</w:t>
+              <w:t>Grade 0,5 grau cobrindo o Brasil (~7.500 pontos) com {lat, lon, s4, vtec, score} por ponto; o score de cada ponto pondera também VTEC e ROTI quando disponíveis</w:t>
             </w:r>
           </w:p>
         </w:tc>
@@ -8470,7 +8470,7 @@
         <w:jc w:val="both"/>
       </w:pPr>
       <w:r>
-        <w:t>Persistencia de historico: a cada requisicao /status bem-sucedida, o sistema persiste o snapshot (score, Kp, Dst, F10.7, S4, sigma_phi, ROTI, VTEC) em banco SQLite localizado em /data/historia.db (volume Railway montado). A retencao e de 48 horas, com deduplicacao automatica (ignora escrita se ja existe registro para a mesma localizacao nos ultimos 10 minutos). Operacoes de banco sao executadas em asyncio.to_thread() para nao bloquear o event loop.</w:t>
+        <w:t>Persistência de histórico: a cada requisição /status bem-sucedida, o sistema persiste o snapshot (score, Kp, Dst, F10.7, S4, sigma_phi, ROTI, VTEC) em banco SQLite localizado em /data/historia.db (volume Railway montado). A retenção é de 48 horas, com deduplicação automática (ignora escrita se já existe registro para a mesma localização nos últimos 10 minutos). Operações de banco são executadas em asyncio.to_thread() para não bloquear o event loop.</w:t>
       </w:r>
     </w:p>
     <w:p>
@@ -8531,7 +8531,7 @@
         <w:jc w:val="both"/>
       </w:pPr>
       <w:r>
-        <w:t>O frontend e um Progressive Web App (PWA) implementado em HTML5, CSS3 e JavaScript puro (sem frameworks). Um unico arquivo index.html contem toda a logica da aplicacao. O deploy e feito automaticamente via GitHub Actions para o GitHub Pages a cada push no branch main.</w:t>
+        <w:t>O frontend é um Progressive Web App (PWA) implementado em HTML5, CSS3 e JavaScript puro (sem frameworks). Um único arquivo index.html contém toda a lógica da aplicação. O deploy é feito automaticamente via GitHub Actions para o GitHub Pages a cada push no branch main.</w:t>
       </w:r>
     </w:p>
     <w:p>
@@ -8564,7 +8564,7 @@
         <w:jc w:val="both"/>
       </w:pPr>
       <w:r>
-        <w:t>Geolocalizacao: usa a API Geolocation do browser para obter lat/lon do usuario e consultar o /status do backend.</w:t>
+        <w:t>Geolocalização: usa a API Geolocation do browser para obter lat/lon do usuário e consultar o /status do backend.</w:t>
       </w:r>
     </w:p>
     <w:p>
@@ -8578,7 +8578,7 @@
         <w:jc w:val="both"/>
       </w:pPr>
       <w:r>
-        <w:t>Score card principal: exibe nivel de risco (BAIXO/MEDIO/ALTO) com cor e barra de progresso animada.</w:t>
+        <w:t>Score card principal: exibe nível de risco (BAIXO/MÉDIO/ALTO) com cor e barra de progresso animada.</w:t>
       </w:r>
     </w:p>
     <w:p>
@@ -8592,7 +8592,7 @@
         <w:jc w:val="both"/>
       </w:pPr>
       <w:r>
-        <w:t>Cards de indices: 7 cards (Kp, Dst, S4, F10.7, sigma_phi, VTEC, ROTI) com barras coloridas indicando a zona de risco e badges de tendencia (seta para cima, baixo ou lateral) calculados comparando a ultima e a penultima leitura armazenadas em localStorage.</w:t>
+        <w:t>Cards de índices: 7 cards (Kp, Dst, S4, F10.7, sigma_phi, VTEC, ROTI) com barras coloridas indicando a zona de risco e badges de tendência (seta para cima, baixo ou lateral) calculados comparando a última e a penúltima leitura armazenadas em localStorage.</w:t>
       </w:r>
     </w:p>
     <w:p>
@@ -8606,7 +8606,7 @@
         <w:jc w:val="both"/>
       </w:pPr>
       <w:r>
-        <w:t>Mapa ionosferico: mapa Leaflet com tiles CartoDB Dark + marcador da localizacao do usuario. Heatmap de retangulos 1,5 x 1,5 graus coloridos por score (ativavel via toggle), alimentado pelo endpoint /heatmap.</w:t>
+        <w:t>Mapa ionosférico: mapa Leaflet com tiles CartoDB Dark + marcador da localização do usuário. Heatmap de retângulos 1,5 x 1,5 graus coloridos por score (ativável via toggle), alimentado pelo endpoint /heatmap.</w:t>
       </w:r>
     </w:p>
     <w:p>
@@ -8620,7 +8620,7 @@
         <w:jc w:val="both"/>
       </w:pPr>
       <w:r>
-        <w:t>Grafico historico: Chart.js 4.4.1, multiplas series (Score, Kp, Dst, S4, sigma_phi, VTEC, ROTI), buscando dados do /history com fallback para localStorage.</w:t>
+        <w:t>Gráfico histórico: Chart.js 4.4.1, múltiplas séries (Score, Kp, Dst, S4, sigma_phi, VTEC, ROTI), buscando dados do /history com fallback para localStorage.</w:t>
       </w:r>
     </w:p>
     <w:p>
@@ -8634,7 +8634,7 @@
         <w:jc w:val="both"/>
       </w:pPr>
       <w:r>
-        <w:t>Notificacoes push nativas: alerta quando o nivel de risco muda de categoria (ex.: BAIXO -&gt; MEDIO).</w:t>
+        <w:t>Notificações push nativas: alerta quando o nível de risco muda de categoria (ex.: BAIXO -&gt; MÉDIO).</w:t>
       </w:r>
     </w:p>
     <w:p>
@@ -8648,7 +8648,7 @@
         <w:jc w:val="both"/>
       </w:pPr>
       <w:r>
-        <w:t>PWA completo: manifest.json, service worker (cache-first para assets estaticos, network-first para chamadas de API), icones 192px e 512px, instalavel como app nativo.</w:t>
+        <w:t>PWA completo: manifest.json, service worker (cache-first para assets estáticos, network-first para chamadas de API), ícones 192px e 512px, instalável como app nativo.</w:t>
       </w:r>
     </w:p>
     <w:p>
@@ -8662,7 +8662,7 @@
         <w:jc w:val="both"/>
       </w:pPr>
       <w:r>
-        <w:t>Modo offline: banner amarelo informativo quando o dispositivo esta sem conectividade.</w:t>
+        <w:t>Modo offline: banner amarelo informativo quando o dispositivo está sem conectividade.</w:t>
       </w:r>
     </w:p>
     <w:p>
@@ -8709,7 +8709,7 @@
         <w:jc w:val="both"/>
       </w:pPr>
       <w:r>
-        <w:t>O frontend e servido estaticamente pelo GitHub Pages. O workflow .github/workflows/deploy-pages.yml copia o conteudo de frontend/ para o ambiente de Pages a cada push. URL de producao: https://thomasak47.github.io/clima-solar/</w:t>
+        <w:t>O frontend é servido estaticamente pelo GitHub Pages. O workflow .github/workflows/deploy-pages.yml copia o conteúdo de frontend/ para o ambiente de Pages a cada push. URL de produção: https://thomasak47.github.io/clima-solar/</w:t>
       </w:r>
     </w:p>
     <w:p>
@@ -8741,7 +8741,7 @@
           <w:szCs w:val="24"/>
         </w:rPr>
         <w:lastRenderedPageBreak/>
-        <w:t>8. Limitacoes e Trabalhos Futuros</w:t>
+        <w:t>8. Limitações e Trabalhos Futuros</w:t>
       </w:r>
       <w:bookmarkEnd w:id="26"/>
     </w:p>
@@ -8760,7 +8760,7 @@
           <w:sz w:val="24"/>
           <w:szCs w:val="24"/>
         </w:rPr>
-        <w:t>8.1 Limitacoes Atuais</w:t>
+        <w:t>8.1 Limitações Atuais</w:t>
       </w:r>
       <w:bookmarkEnd w:id="27"/>
     </w:p>
@@ -8775,7 +8775,7 @@
         <w:jc w:val="both"/>
       </w:pPr>
       <w:r>
-        <w:t>Defasagem dos dados EMBRACE: o produto de mapa EMBRACE/INPE tem defasagem tipica de 6 a 9 horas em relacao ao tempo real. Isso e intrinseco ao fluxo de processamento do instituto e nao pode ser reduzido pelo aplicativo.</w:t>
+        <w:t>Defasagem dos dados EMBRACE: o produto de mapa EMBRACE/INPE tem defasagem típica de 6 a 9 horas em relação ao tempo real. Isso é intrínseco ao fluxo de processamento do instituto e não pode ser reduzido pelo aplicativo.</w:t>
       </w:r>
     </w:p>
     <w:p>
@@ -8789,7 +8789,7 @@
         <w:jc w:val="both"/>
       </w:pPr>
       <w:r>
-        <w:t>Cobertura geografica limitada: a grade EMBRACE cobre longitude -140 a -20 graus e latitude -60 a +50 graus (Americas). Requisicoes de pontos fora dessa janela retornam S4 e sigma_phi como null, com redistribuicao de pesos.</w:t>
+        <w:t>Cobertura geográfica limitada: a grade EMBRACE cobre longitude -140 a -20 graus e latitude -60 a +50 graus (Américas). Requisições de pontos fora dessa janela retornam S4 e sigma_phi como null, com redistribuição de pesos.</w:t>
       </w:r>
     </w:p>
     <w:p>
@@ -8803,7 +8803,7 @@
         <w:jc w:val="both"/>
       </w:pPr>
       <w:r>
-        <w:t>Defasagem de VTEC e ROTI: os produtos AMAP e GTEX do EMBRACE sao publicados com ~1,5 a 2 dias de atraso. A estrategia de correspondencia de horario do dia mitiga o efeito do ciclo diurno, mas nao captura eventos transientes (tempestades) iniciados apos a ultima publicacao — nesses casos os indices em tempo real (Kp, Dst) sao os primeiros a refletir o evento. A defasagem real e exibida ao usuario e reportada na API.</w:t>
+        <w:t>Defasagem de VTEC e ROTI: os produtos AMAP e GTEX do EMBRACE são publicados com ~1,5 a 2 dias de atraso. A estratégia de correspondência de horário do dia mitiga o efeito do ciclo diurno, mas não captura eventos transientes (tempestades) iniciados após a última publicação — nesses casos os índices em tempo real (Kp, Dst) são os primeiros a refletir o evento. A defasagem real é exibida ao usuário e reportada na API.</w:t>
       </w:r>
     </w:p>
     <w:p>
@@ -8817,7 +8817,7 @@
         <w:jc w:val="both"/>
       </w:pPr>
       <w:r>
-        <w:t>Historico por localizacao, sem autenticacao de usuario: o historico SQLite e indexado por coordenadas arredondadas a 1 decimal de grau (~11 km de precisao). Nao ha identificacao de dispositivo ou usuario, o que pode causar colisoes em areas de alta densidade.</w:t>
+        <w:t>Histórico por localização, sem autenticação de usuário: o histórico SQLite é indexado por coordenadas arredondadas a 1 decimal de grau (~11 km de precisão). Não há identificação de dispositivo ou usuário, o que pode causar colisões em áreas de alta densidade.</w:t>
       </w:r>
     </w:p>
     <w:p>
@@ -8831,7 +8831,7 @@
         <w:jc w:val="both"/>
       </w:pPr>
       <w:r>
-        <w:t>Banco de dados SQLite: adequado para o volume atual (um registro por localizacao a cada 10 min, retencao de 48h). Para escalas maiores, seria necessaria migracao para PostgreSQL.</w:t>
+        <w:t>Banco de dados SQLite: adequado para o volume atual (um registro por localização a cada 10 min, retenção de 48h). Para escalas maiores, seria necessária migração para PostgreSQL.</w:t>
       </w:r>
     </w:p>
     <w:p>
@@ -8869,7 +8869,7 @@
         <w:jc w:val="both"/>
       </w:pPr>
       <w:r>
-        <w:t>VTEC em tempo quase-real: o visualizador EMBRACE (AGCTecViewer) publica imagens PNG do mapa TEC a cada 10 minutos com dados do dia corrente (servlet_image_rt.jsp). A decodificacao cor-para-TECU dessas imagens, usando a escala oficial de 0 a 80 TECU, permitiria substituir a correspondencia de horario do dia por dados de fato em tempo real. Alternativa: IONEX do IGS/NASA CDDIS com produtos rapidos.</w:t>
+        <w:t>VTEC em tempo quase-real: o visualizador EMBRACE (AGCTecViewer) publica imagens PNG do mapa TEC a cada 10 minutos com dados do dia corrente (servlet_image_rt.jsp). A decodificação cor-para-TECU dessas imagens, usando a escala oficial de 0 a 80 TECU, permitiria substituir a correspondência de horário do dia por dados de fato em tempo real. Alternativa: IONEX do IGS/NASA CDDIS com produtos rápidos.</w:t>
       </w:r>
     </w:p>
     <w:p>
@@ -8883,7 +8883,7 @@
         <w:jc w:val="both"/>
       </w:pPr>
       <w:r>
-        <w:t>Migracao para PostgreSQL no Railway: necessaria se a base de usuarios crescer significativamente, aproveitando o suporte nativo do Railway a PostgreSQL.</w:t>
+        <w:t>Migração para PostgreSQL no Railway: necessária se a base de usuários crescer significativamente, aproveitando o suporte nativo do Railway a PostgreSQL.</w:t>
       </w:r>
     </w:p>
     <w:p>
@@ -8897,7 +8897,7 @@
         <w:jc w:val="both"/>
       </w:pPr>
       <w:r>
-        <w:t>Historico por dispositivo: implementar identificacao de sessao (token anonimo ou autenticacao leve) para separar historicos de diferentes usuarios na mesma regiao.</w:t>
+        <w:t>Histórico por dispositivo: implementar identificação de sessão (token anônimo ou autenticação leve) para separar históricos de diferentes usuários na mesma região.</w:t>
       </w:r>
     </w:p>
     <w:p>
@@ -8911,7 +8911,7 @@
         <w:jc w:val="both"/>
       </w:pPr>
       <w:r>
-        <w:t>Alertas por email/webhook: alem das notificacoes push do browser, enviar alertas proativos por email ou webhook (ex.: Slack) quando o score superar limiares configurados pelo usuario.</w:t>
+        <w:t>Alertas por email/webhook: além das notificações push do browser, enviar alertas proativos por email ou webhook (ex.: Slack) quando o score superar limiares configurados pelo usuário.</w:t>
       </w:r>
     </w:p>
     <w:p>
@@ -8998,7 +8998,7 @@
           <w:szCs w:val="24"/>
           <w:lang w:val="en-US"/>
         </w:rPr>
-        <w:t>9. Referencias</w:t>
+        <w:t>9. Referências</w:t>
       </w:r>
       <w:bookmarkEnd w:id="29"/>
     </w:p>
@@ -9015,7 +9015,7 @@
           <w:lang w:val="en-US"/>
         </w:rPr>
         <w:lastRenderedPageBreak/>
-        <w:t>[1] NOAA Space Weather Prediction Center (SWPC). Real-Time Solar Wind and Geomagnetic Indices.</w:t>
+        <w:t>[1] NOAA Space Weather Prediction Center (SWPC). Real-Time Solar Wind and Geomagnetic Índices.</w:t>
       </w:r>
     </w:p>
     <w:p>
@@ -9030,7 +9030,7 @@
         <w:t xml:space="preserve">     </w:t>
       </w:r>
       <w:r>
-        <w:t xml:space="preserve">Disponivel em: </w:t>
+        <w:t xml:space="preserve">Disponível em: </w:t>
         <w:fldChar w:fldCharType="begin"/>
         <w:instrText>HYPERLINK "https://www.swpc.noaa.gov"</w:instrText>
         <w:fldChar w:fldCharType="separate"/>
@@ -9057,7 +9057,7 @@
         <w:rPr>
           <w:lang w:val="en-US"/>
         </w:rPr>
-        <w:t>[2] Kyoto World Data Center for Geomagnetism. Dst Index. Kyoto University, Japao.</w:t>
+        <w:t>[2] Kyoto World Data Center for Geomagnetism. Dst Index. Kyoto University, Japão.</w:t>
       </w:r>
     </w:p>
     <w:p>
@@ -9072,7 +9072,7 @@
         <w:t xml:space="preserve">     </w:t>
       </w:r>
       <w:r>
-        <w:t xml:space="preserve">Disponivel em: </w:t>
+        <w:t xml:space="preserve">Disponível em: </w:t>
         <w:fldChar w:fldCharType="begin"/>
         <w:instrText>HYPERLINK "http://wdc.kugi.kyoto-u.ac.jp/dstdir/"</w:instrText>
         <w:fldChar w:fldCharType="separate"/>
@@ -9093,7 +9093,7 @@
         <w:jc w:val="both"/>
       </w:pPr>
       <w:r>
-        <w:t>[3] EMBRACE — Estudo e Monitoramento Brasileiro do Clima Espacial. INPE, Sao Jose dos Campos, Brasil.</w:t>
+        <w:t>[3] EMBRACE — Estudo e Monitoramento Brasileiro do Clima Espacial. INPE, São José dos Campos, Brasil.</w:t>
       </w:r>
     </w:p>
     <w:p>
@@ -9102,7 +9102,7 @@
         <w:jc w:val="both"/>
       </w:pPr>
       <w:r>
-        <w:t xml:space="preserve">     Disponivel em: </w:t>
+        <w:t xml:space="preserve">     Disponível em: </w:t>
         <w:fldChar w:fldCharType="begin"/>
         <w:instrText>HYPERLINK "http://www2.inpe.br/climaespacial/portal/embrace/"</w:instrText>
         <w:fldChar w:fldCharType="separate"/>
@@ -9138,7 +9138,7 @@
         <w:jc w:val="both"/>
       </w:pPr>
       <w:r>
-        <w:t xml:space="preserve">     Disponivel em: </w:t>
+        <w:t xml:space="preserve">     Disponível em: </w:t>
         <w:fldChar w:fldCharType="begin"/>
         <w:instrText>HYPERLINK "https://cddis.nasa.gov/archive/gnss/products/ionex/"</w:instrText>
         <w:fldChar w:fldCharType="separate"/>
@@ -9159,7 +9159,7 @@
         <w:jc w:val="both"/>
       </w:pPr>
       <w:r>
-        <w:t>[5] FastAPI. Tiangolo. Disponivel em: https://fastapi.tiangolo.com</w:t>
+        <w:t>[5] FastAPI. Tiangolo. Disponível em: https://fastapi.tiangolo.com</w:t>
       </w:r>
     </w:p>
     <w:p>
@@ -9174,7 +9174,7 @@
         <w:rPr>
           <w:lang w:val="en-US"/>
         </w:rPr>
-        <w:t>[6] Leaflet.js — an open-source JavaScript library for mobile-friendly interactive maps (v1.9.4). Disponivel em: https://leafletjs.com</w:t>
+        <w:t>[6] Leaflet.js — an open-source JavaScript library for mobile-friendly interactive maps (v1.9.4). Disponível em: https://leafletjs.com</w:t>
       </w:r>
     </w:p>
     <w:p>
@@ -9189,7 +9189,7 @@
         <w:t xml:space="preserve">[7] Chart.js — Simple yet flexible JavaScript charting library (v4.4.1). </w:t>
       </w:r>
       <w:r>
-        <w:t>Disponivel em: https://www.chartjs.org</w:t>
+        <w:t>Disponível em: https://www.chartjs.org</w:t>
       </w:r>
     </w:p>
     <w:p>
@@ -9198,7 +9198,7 @@
         <w:jc w:val="both"/>
       </w:pPr>
       <w:r>
-        <w:t>[8] EMBRACE/INPE. Servidor publico de dados (produtos AMAP, GTEX e scintillation). Disponivel em: https://embracedata.inpe.br</w:t>
+        <w:t>[8] EMBRACE/INPE. Servidor público de dados (produtos AMAP, GTEX e scintillation). Disponível em: https://embracedata.inpe.br</w:t>
       </w:r>
     </w:p>
     <w:p>
@@ -9210,7 +9210,7 @@
         <w:rPr>
           <w:lang w:val="en-US"/>
         </w:rPr>
-        <w:t>[9] Carmo, C. S. et al. (2021). Evaluation of Different Methods for Calculating the ROTI Index Over the Brazilian Sector. Radio Science, 56. doi:10.1029/2020RS007140</w:t>
+        <w:t>[9] Carmo, C. S. et al. (2021). Evaluation of Different Methods for Calculating the ROTI Index Over the Brazilian Sector. Rádio Science, 56. doi:10.1029/2020RS007140</w:t>
       </w:r>
     </w:p>
     <w:p>
@@ -9268,7 +9268,7 @@
         <w:sz w:val="18"/>
         <w:szCs w:val="18"/>
       </w:rPr>
-      <w:t xml:space="preserve">Clima Solar — Documentacao Tecnica  |  Pagina </w:t>
+      <w:t xml:space="preserve">Clima Solar — Documentação Técnica  |  Página </w:t>
     </w:r>
     <w:r>
       <w:rPr>

</xml_diff>